<commit_message>
update: Strategie v2 — Philosophie-Klammer, Ökosystem, CM prominent, Newsletter als Owned Asset, Pam-Rolle, KI-Sprache — DungeonMasterAlex
</commit_message>
<xml_diff>
--- a/belle-immo-ag/strategies/belle-immo-kommunikationsstrategie-2026.docx
+++ b/belle-immo-ag/strategies/belle-immo-kommunikationsstrategie-2026.docx
@@ -15,18 +15,18 @@
         <w:tc>
           <w:tcPr>
             <w:tcW w:type="dxa" w:w="9066"/>
-            <w:shd w:val="clear" w:color="auto" w:fill="055a8d"/>
+            <w:shd w:val="clear" w:color="auto" w:fill="033d62"/>
           </w:tcPr>
           <w:p>
             <w:pPr>
-              <w:spacing w:before="600" w:after="200"/>
+              <w:spacing w:before="700"/>
             </w:pPr>
             <w:r>
               <w:rPr>
                 <w:rFonts w:ascii="Calibri" w:hAnsi="Calibri"/>
                 <w:b/>
                 <w:color w:val="FFFFFF"/>
-                <w:sz w:val="52"/>
+                <w:sz w:val="56"/>
               </w:rPr>
               <w:br/>
               <w:t xml:space="preserve">  Belle Immo AG</w:t>
@@ -34,18 +34,28 @@
             </w:r>
           </w:p>
           <w:p>
+            <w:r>
+              <w:rPr>
+                <w:rFonts w:ascii="Calibri" w:hAnsi="Calibri"/>
+                <w:color w:val="BBD8EE"/>
+                <w:sz w:val="27"/>
+              </w:rPr>
+              <w:t xml:space="preserve">  Die erste Adresse für Immobilienfragen in der Region</w:t>
+              <w:br/>
+            </w:r>
+          </w:p>
+          <w:p>
             <w:pPr>
-              <w:spacing w:after="600"/>
+              <w:spacing w:after="700"/>
             </w:pPr>
             <w:r>
               <w:rPr>
                 <w:rFonts w:ascii="Calibri" w:hAnsi="Calibri"/>
-                <w:color w:val="CCE0F0"/>
-                <w:sz w:val="26"/>
+                <w:i/>
+                <w:color w:val="88AACC"/>
+                <w:sz w:val="22"/>
               </w:rPr>
               <w:t xml:space="preserve">  Kommunikationsstrategie 2026</w:t>
-              <w:br/>
-              <w:t xml:space="preserve">  «Vom Makler zum regionalen Anlaufpunkt»</w:t>
               <w:br/>
               <w:t xml:space="preserve"> </w:t>
             </w:r>
@@ -55,7 +65,7 @@
     </w:tbl>
     <w:p>
       <w:pPr>
-        <w:spacing w:before="200" w:after="40"/>
+        <w:spacing w:before="240"/>
       </w:pPr>
       <w:r>
         <w:rPr>
@@ -103,7 +113,7 @@
           <w:rFonts w:ascii="Calibri" w:hAnsi="Calibri"/>
           <w:sz w:val="20"/>
         </w:rPr>
-        <w:t xml:space="preserve">LinkedIn Report Q2 2026     </w:t>
+        <w:t xml:space="preserve">LinkedIn Report Q2 2026 (März–Juni 2026)     </w:t>
       </w:r>
       <w:r>
         <w:rPr>
@@ -129,13 +139,110 @@
     </w:p>
     <w:p>
       <w:pPr>
-        <w:spacing w:before="360" w:after="120"/>
+        <w:spacing w:before="400" w:after="80"/>
       </w:pPr>
       <w:r>
         <w:rPr>
+          <w:rFonts w:ascii="Calibri" w:hAnsi="Calibri"/>
           <w:b/>
           <w:color w:val="055A8D"/>
-          <w:sz w:val="36"/>
+          <w:sz w:val="34"/>
+        </w:rPr>
+        <w:t>Die Philosophie hinter dieser Strategie</w:t>
+      </w:r>
+    </w:p>
+    <w:p>
+      <w:pPr>
+        <w:pBdr>
+          <w:bottom w:val="single" w:sz="6" w:space="1" w:color="055a8d"/>
+        </w:pBdr>
+        <w:spacing w:before="80" w:after="120"/>
+      </w:pPr>
+    </w:p>
+    <w:tbl>
+      <w:tblPr>
+        <w:tblStyle w:val="TableGrid"/>
+        <w:tblW w:type="auto" w:w="0"/>
+        <w:tblLook w:firstColumn="1" w:firstRow="1" w:lastColumn="0" w:lastRow="0" w:noHBand="0" w:noVBand="1" w:val="04A0"/>
+      </w:tblPr>
+      <w:tblGrid>
+        <w:gridCol w:w="9066"/>
+      </w:tblGrid>
+      <w:tr>
+        <w:tc>
+          <w:tcPr>
+            <w:tcW w:type="dxa" w:w="9066"/>
+            <w:shd w:val="clear" w:color="auto" w:fill="033d62"/>
+            <w:tcBorders>
+              <w:top w:val="single" w:sz="8" w:space="0" w:color="E8A820"/>
+              <w:left w:val="single" w:sz="8" w:space="0" w:color="E8A820"/>
+              <w:bottom w:val="single" w:sz="8" w:space="0" w:color="E8A820"/>
+              <w:right w:val="single" w:sz="8" w:space="0" w:color="E8A820"/>
+            </w:tcBorders>
+          </w:tcPr>
+          <w:p>
+            <w:pPr>
+              <w:spacing w:before="200" w:after="200"/>
+              <w:jc w:val="center"/>
+            </w:pPr>
+            <w:r>
+              <w:rPr>
+                <w:rFonts w:ascii="Calibri" w:hAnsi="Calibri"/>
+                <w:b w:val="0"/>
+                <w:i/>
+                <w:color w:val="DDEEF8"/>
+                <w:sz w:val="23"/>
+              </w:rPr>
+              <w:t>«Immobilienentscheidungen entstehen selten spontan. Niemand verkauft nächste Woche sein Haus. Niemand kauft morgen Bauland. Niemand sucht heute einen Investor. Aber wenn dieser Moment kommt — dann soll Belle Immo bereits bekannt, vertraut und die selbstverständliche erste Adresse sein.</w:t>
+              <w:br/>
+              <w:br/>
+              <w:t>Deshalb bauen wir kein Marketing. Wir bauen Vertrauen vor dem Kauf.»</w:t>
+            </w:r>
+          </w:p>
+        </w:tc>
+      </w:tr>
+    </w:tbl>
+    <w:p>
+      <w:pPr>
+        <w:spacing w:after="120"/>
+      </w:pPr>
+    </w:p>
+    <w:p>
+      <w:pPr>
+        <w:spacing w:before="40" w:after="120" w:line="290" w:lineRule="exact"/>
+      </w:pPr>
+      <w:r>
+        <w:rPr>
+          <w:rFonts w:ascii="Calibri" w:hAnsi="Calibri"/>
+          <w:i w:val="0"/>
+          <w:sz w:val="21"/>
+        </w:rPr>
+        <w:t>Das ist der eigentliche Unterschied zu klassischer Social-Media-Arbeit oder kurzfristigen Kampagnen: Wir erzeugen keine Aufmerksamkeit für den Moment. Wir verankern Belle Immo langfristig in den Köpfen der Menschen in der Region — sodass im entscheidenden Moment automatisch ein Name kommt: Belle Immo.</w:t>
+      </w:r>
+    </w:p>
+    <w:p>
+      <w:pPr>
+        <w:spacing w:before="40" w:after="120" w:line="290" w:lineRule="exact"/>
+      </w:pPr>
+      <w:r>
+        <w:rPr>
+          <w:rFonts w:ascii="Calibri" w:hAnsi="Calibri"/>
+          <w:i w:val="0"/>
+          <w:sz w:val="21"/>
+        </w:rPr>
+        <w:t>Wer über Monate oder Jahre regelmässig wertvolle Inhalte von Belle Immo sieht, verbindet das Unternehmen im entscheidenden Moment automatisch mit Kompetenz und Vertrauen. Das ist die eigentliche Philosophie hinter der gesamten Strategie.</w:t>
+      </w:r>
+    </w:p>
+    <w:p>
+      <w:pPr>
+        <w:spacing w:before="400" w:after="80"/>
+      </w:pPr>
+      <w:r>
+        <w:rPr>
+          <w:rFonts w:ascii="Calibri" w:hAnsi="Calibri"/>
+          <w:b/>
+          <w:color w:val="055A8D"/>
+          <w:sz w:val="34"/>
         </w:rPr>
         <w:t>1. Ausgangslage</w:t>
       </w:r>
@@ -145,15 +252,16 @@
         <w:pBdr>
           <w:bottom w:val="single" w:sz="6" w:space="1" w:color="055a8d"/>
         </w:pBdr>
-        <w:spacing w:before="40" w:after="120"/>
+        <w:spacing w:before="80" w:after="120"/>
       </w:pPr>
     </w:p>
     <w:p>
       <w:pPr>
-        <w:spacing w:before="40" w:after="120" w:line="280" w:lineRule="exact"/>
+        <w:spacing w:before="40" w:after="120" w:line="290" w:lineRule="exact"/>
       </w:pPr>
       <w:r>
         <w:rPr>
+          <w:rFonts w:ascii="Calibri" w:hAnsi="Calibri"/>
           <w:i w:val="0"/>
           <w:sz w:val="21"/>
         </w:rPr>
@@ -162,26 +270,15 @@
     </w:p>
     <w:p>
       <w:pPr>
-        <w:spacing w:before="40" w:after="120" w:line="280" w:lineRule="exact"/>
+        <w:spacing w:before="40" w:after="120" w:line="290" w:lineRule="exact"/>
       </w:pPr>
       <w:r>
         <w:rPr>
+          <w:rFonts w:ascii="Calibri" w:hAnsi="Calibri"/>
           <w:i w:val="0"/>
           <w:sz w:val="21"/>
         </w:rPr>
-        <w:t>Das Personal Branding von Roger Brand, das in den letzten Monaten pausiert war, läuft nun wieder an. Dieser Neustart ist der Auslöser für die vorliegende Strategie: Wir wollen nicht einfach dort weitermachen, wo wir aufgehört haben — wir wollen den Ansatz von «einfach posten» auf das nächste Level bringen.</w:t>
-      </w:r>
-    </w:p>
-    <w:p>
-      <w:pPr>
-        <w:spacing w:before="40" w:after="120" w:line="280" w:lineRule="exact"/>
-      </w:pPr>
-      <w:r>
-        <w:rPr>
-          <w:i w:val="0"/>
-          <w:sz w:val="21"/>
-        </w:rPr>
-        <w:t>Der Q2-Report zeigt, wo der Hebel liegt: Die Content-Qualität ist gut (Engagement-Rates von 31–45% bei Top-Posts), aber Wachstum und Sichtbarkeit stagnieren. +7 Follower in 90 Tagen ist bei einer Audience von 394 Personen Stillstand. Das Problem liegt nicht am «Was», sondern am «Wie viele Leute sehen es» — und an der fehlenden aktiven Interaktion im Netzwerk. Community Management war bislang praktisch inexistent (6 Kommentare in 90 Tagen).</w:t>
+        <w:t>Das Personal Branding von Roger Brand, das in den letzten Monaten pausiert war, läuft nun wieder an. Dieser Neustart ist der Auslöser für die vorliegende Strategie: Wir wollen nicht einfach dort weitermachen, wo wir aufgehört haben — wir wollen den Ansatz von «einfach posten» auf das nächste Level bringen und ein verzahntes Kommunikationssystem aufbauen.</w:t>
       </w:r>
     </w:p>
     <w:tbl>
@@ -200,22 +297,23 @@
             <w:shd w:val="clear" w:color="auto" w:fill="EBF4FA"/>
             <w:tcBorders>
               <w:top w:val="single" w:sz="4" w:space="0" w:color="055a8d"/>
-              <w:left w:val="single" w:sz="12" w:space="0" w:color="055a8d"/>
+              <w:left w:val="single" w:sz="14" w:space="0" w:color="055a8d"/>
               <w:bottom w:val="single" w:sz="4" w:space="0" w:color="055a8d"/>
               <w:right w:val="none" w:sz="0" w:space="0" w:color="auto"/>
             </w:tcBorders>
           </w:tcPr>
           <w:p>
             <w:pPr>
-              <w:spacing w:before="80" w:after="80"/>
+              <w:spacing w:before="100" w:after="100"/>
             </w:pPr>
             <w:r>
               <w:rPr>
+                <w:rFonts w:ascii="Calibri" w:hAnsi="Calibri"/>
                 <w:i/>
                 <w:color w:val="055A8D"/>
                 <w:sz w:val="20"/>
               </w:rPr>
-              <w:t>Befund: 3 von 4 strategischen Zielen kaum bespielt — Land finden: 0 Posts, Investoren: 1 Post, während 69% der Beiträge auf Vertrauen einzahlen. Gut als Basis — aber allein nicht ausreichend.</w:t>
+              <w:t>Q2-Befund: Content-Qualität stimmt (ER 31–45%), aber Wachstum stagniert (+7 Follower/90 Tage). 3 von 4 strategischen Zielen kaum bespielt — Land finden: 0 Posts, Investoren: 1 Post. Community Management praktisch inexistent: 6 Kommentare in 90 Tagen.</w:t>
             </w:r>
           </w:p>
         </w:tc>
@@ -228,13 +326,14 @@
     </w:p>
     <w:p>
       <w:pPr>
-        <w:spacing w:before="360" w:after="120"/>
+        <w:spacing w:before="400" w:after="80"/>
       </w:pPr>
       <w:r>
         <w:rPr>
+          <w:rFonts w:ascii="Calibri" w:hAnsi="Calibri"/>
           <w:b/>
           <w:color w:val="055A8D"/>
-          <w:sz w:val="36"/>
+          <w:sz w:val="34"/>
         </w:rPr>
         <w:t>2. Das Ziel</w:t>
       </w:r>
@@ -244,110 +343,297 @@
         <w:pBdr>
           <w:bottom w:val="single" w:sz="6" w:space="1" w:color="055a8d"/>
         </w:pBdr>
-        <w:spacing w:before="40" w:after="120"/>
+        <w:spacing w:before="80" w:after="120"/>
       </w:pPr>
     </w:p>
     <w:p>
       <w:pPr>
-        <w:spacing w:before="40" w:after="120" w:line="280" w:lineRule="exact"/>
+        <w:spacing w:before="40" w:after="120" w:line="290" w:lineRule="exact"/>
       </w:pPr>
       <w:r>
         <w:rPr>
+          <w:rFonts w:ascii="Calibri" w:hAnsi="Calibri"/>
           <w:i w:val="0"/>
           <w:sz w:val="21"/>
         </w:rPr>
-        <w:t>Das übergeordnete Ziel: Belle Immo als der regionale Anlaufpunkt im Umkreis von 10–20 km für alle Immobilienentscheidungen — Landkauf, Immobilienverkauf, Immobilienentwicklung, Nachfolgeregelungen, Erbschaften und Potenzialentwicklungen.</w:t>
+        <w:t>Das übergeordnete Ziel: Belle Immo wird die erste Adresse für Immobilienfragen in der Region — im Umkreis von 10–20 km, für alle relevanten Entscheidungen: Landkauf, Immobilienverkauf, Immobilienentwicklung, Nachfolgeregelungen, Erbschaften und Potenzialentwicklungen. Wenn jemand in der Region vor einer Immobilienentscheidung steht, kommt ein Name: Belle Immo.</w:t>
       </w:r>
     </w:p>
     <w:p>
       <w:pPr>
-        <w:spacing w:before="200" w:after="40"/>
+        <w:spacing w:before="180" w:after="40"/>
       </w:pPr>
       <w:r>
         <w:rPr>
+          <w:rFonts w:ascii="Calibri" w:hAnsi="Calibri"/>
           <w:b/>
-          <w:color w:val="333333"/>
-          <w:sz w:val="22"/>
+          <w:color w:val="222222"/>
+          <w:sz w:val="21"/>
         </w:rPr>
-        <w:t>Konkret für die nächsten 6–12 Monate:</w:t>
+        <w:t>Messbare Ziele für die nächsten 6–12 Monate:</w:t>
       </w:r>
     </w:p>
     <w:p>
       <w:pPr>
         <w:pStyle w:val="ListBullet"/>
-        <w:spacing w:before="20" w:after="60"/>
+        <w:spacing w:before="20" w:after="80"/>
         <w:ind w:left="283"/>
       </w:pPr>
       <w:r>
         <w:rPr>
+          <w:rFonts w:ascii="Calibri" w:hAnsi="Calibri"/>
           <w:sz w:val="21"/>
         </w:rPr>
-        <w:t>Personal Branding reaktivieren: Roger Brand als Fachstimme schrittweise wieder aufbauen, mit klarem System statt spontanen Posts.</w:t>
+        <w:t>Personal Branding reaktivieren: Roger Brand schrittweise als Fachstimme aufbauen — mit System statt spontanen Posts.</w:t>
       </w:r>
     </w:p>
     <w:p>
       <w:pPr>
         <w:pStyle w:val="ListBullet"/>
-        <w:spacing w:before="20" w:after="60"/>
+        <w:spacing w:before="20" w:after="80"/>
         <w:ind w:left="283"/>
       </w:pPr>
       <w:r>
         <w:rPr>
+          <w:rFonts w:ascii="Calibri" w:hAnsi="Calibri"/>
           <w:sz w:val="21"/>
         </w:rPr>
-        <w:t>Community Management starten: Roger kommentiert 1x pro Woche gezielt im relevanten Netzwerk (KI-unterstützt). Alex lädt Rogers Kontakte aktiv zur Belle Immo Seite ein.</w:t>
+        <w:t>Community Management starten: Roger beginnt mit 1 qualifiziertem Kommentar pro Woche, mit dem Ziel, den Rhythmus schrittweise auf mehrere Interaktionen pro Woche auszubauen. Alex übernimmt das aktive Einladen von Rogers Kontakten zur Belle Immo Seite.</w:t>
       </w:r>
     </w:p>
     <w:p>
       <w:pPr>
         <w:pStyle w:val="ListBullet"/>
-        <w:spacing w:before="20" w:after="60"/>
+        <w:spacing w:before="20" w:after="80"/>
         <w:ind w:left="283"/>
       </w:pPr>
       <w:r>
         <w:rPr>
+          <w:rFonts w:ascii="Calibri" w:hAnsi="Calibri"/>
           <w:sz w:val="21"/>
         </w:rPr>
-        <w:t>Content-Balance korrigieren: ~6 Posts/Monat nach definiertem Mix — alle 4 strategischen Ziele bespielt.</w:t>
+        <w:t>Content-Balance korrigieren: ~6 Posts/Monat nach definiertem Mix — alle 4 strategischen Ziele bespielt, nicht nur «Vertrauen».</w:t>
       </w:r>
     </w:p>
     <w:p>
       <w:pPr>
         <w:pStyle w:val="ListBullet"/>
-        <w:spacing w:before="20" w:after="60"/>
+        <w:spacing w:before="20" w:after="80"/>
         <w:ind w:left="283"/>
       </w:pPr>
       <w:r>
         <w:rPr>
+          <w:rFonts w:ascii="Calibri" w:hAnsi="Calibri"/>
           <w:sz w:val="21"/>
         </w:rPr>
-        <w:t>Newsletter-Community aufbauen: Zwischenschritt zwischen Reichweite und konkreter Anfrage.</w:t>
+        <w:t>Newsletter-Community aufbauen: Eigener Kanal, der Belle Immo unabhängig von Algorithmen macht.</w:t>
       </w:r>
     </w:p>
     <w:p>
       <w:pPr>
         <w:pStyle w:val="ListBullet"/>
-        <w:spacing w:before="20" w:after="60"/>
+        <w:spacing w:before="20" w:after="80"/>
         <w:ind w:left="283"/>
       </w:pPr>
       <w:r>
         <w:rPr>
+          <w:rFonts w:ascii="Calibri" w:hAnsi="Calibri"/>
           <w:sz w:val="21"/>
         </w:rPr>
-        <w:t>Mindestens eine Kampagne dauerhaft aktiv: auf langfristige Bindung optimiert, nicht auf kurzfristige Conversions.</w:t>
+        <w:t>Mindestens eine Kampagne dauerhaft aktiv: auf langfristige Bindung optimiert.</w:t>
       </w:r>
     </w:p>
     <w:p>
       <w:pPr>
         <w:pStyle w:val="ListBullet"/>
-        <w:spacing w:before="20" w:after="60"/>
+        <w:spacing w:before="20" w:after="80"/>
         <w:ind w:left="283"/>
       </w:pPr>
       <w:r>
         <w:rPr>
+          <w:rFonts w:ascii="Calibri" w:hAnsi="Calibri"/>
           <w:sz w:val="21"/>
         </w:rPr>
         <w:t>Fachstimme in regionalen Medien: regelmässige Fachartikel in Glattaler, IMMOBILIEN Business, NZZ Residence.</w:t>
+      </w:r>
+    </w:p>
+    <w:p>
+      <w:pPr>
+        <w:spacing w:before="400" w:after="80"/>
+      </w:pPr>
+      <w:r>
+        <w:rPr>
+          <w:rFonts w:ascii="Calibri" w:hAnsi="Calibri"/>
+          <w:b/>
+          <w:color w:val="055A8D"/>
+          <w:sz w:val="34"/>
+        </w:rPr>
+        <w:t>3. Die Zielgruppe</w:t>
+      </w:r>
+    </w:p>
+    <w:p>
+      <w:pPr>
+        <w:pBdr>
+          <w:bottom w:val="single" w:sz="6" w:space="1" w:color="055a8d"/>
+        </w:pBdr>
+        <w:spacing w:before="80" w:after="120"/>
+      </w:pPr>
+    </w:p>
+    <w:p>
+      <w:pPr>
+        <w:spacing w:before="280" w:after="60"/>
+      </w:pPr>
+      <w:r>
+        <w:rPr>
+          <w:rFonts w:ascii="Calibri" w:hAnsi="Calibri"/>
+          <w:b/>
+          <w:color w:val="055A8D"/>
+          <w:sz w:val="25"/>
+        </w:rPr>
+        <w:t>Investoren / Kapitalgeber</w:t>
+      </w:r>
+    </w:p>
+    <w:p>
+      <w:pPr>
+        <w:spacing w:before="40" w:after="120" w:line="290" w:lineRule="exact"/>
+      </w:pPr>
+      <w:r>
+        <w:rPr>
+          <w:rFonts w:ascii="Calibri" w:hAnsi="Calibri"/>
+          <w:i w:val="0"/>
+          <w:sz w:val="21"/>
+        </w:rPr>
+        <w:t>Nicht primär institutionelle Investoren, sondern Unternehmer mit Privatvermögen — die 68 Inhaber im Follower-Kreis sind grösstenteils KMU-Eigner und damit das realistischere Potenzial. Ergänzend Family Offices und vermögende Privatpersonen aus dem Grossraum Zürich (80% der Audience). Motivation: solide Rendite, regionaler Bezug, persönliches Vertrauen. Ansprache: Sie, formell, mit Zahlen und Substanz.</w:t>
+      </w:r>
+    </w:p>
+    <w:p>
+      <w:pPr>
+        <w:spacing w:before="280" w:after="60"/>
+      </w:pPr>
+      <w:r>
+        <w:rPr>
+          <w:rFonts w:ascii="Calibri" w:hAnsi="Calibri"/>
+          <w:b/>
+          <w:color w:val="055A8D"/>
+          <w:sz w:val="25"/>
+        </w:rPr>
+        <w:t>Landeigentümer / Erbengemeinschaften / Landwirte</w:t>
+      </w:r>
+    </w:p>
+    <w:p>
+      <w:pPr>
+        <w:spacing w:before="40" w:after="120" w:line="290" w:lineRule="exact"/>
+      </w:pPr>
+      <w:r>
+        <w:rPr>
+          <w:rFonts w:ascii="Calibri" w:hAnsi="Calibri"/>
+          <w:i w:val="0"/>
+          <w:sz w:val="21"/>
+        </w:rPr>
+        <w:t>Bislang komplett unbespielt auf Social Media. Entscheidet selten spontan — Belle Immo muss als diskrete, regional verankerte Adresse präsent sein, wenn der Moment kommt (Nachfolge, Erbschaft, Verkaufsentscheid). Besonders wichtig: offline und über Multiplikatoren erreichbar.</w:t>
+      </w:r>
+    </w:p>
+    <w:p>
+      <w:pPr>
+        <w:spacing w:before="280" w:after="60"/>
+      </w:pPr>
+      <w:r>
+        <w:rPr>
+          <w:rFonts w:ascii="Calibri" w:hAnsi="Calibri"/>
+          <w:b/>
+          <w:color w:val="055A8D"/>
+          <w:sz w:val="25"/>
+        </w:rPr>
+        <w:t>Multiplikatoren — Treuhänder und Notare</w:t>
+      </w:r>
+    </w:p>
+    <w:p>
+      <w:pPr>
+        <w:spacing w:before="40" w:after="120" w:line="290" w:lineRule="exact"/>
+      </w:pPr>
+      <w:r>
+        <w:rPr>
+          <w:rFonts w:ascii="Calibri" w:hAnsi="Calibri"/>
+          <w:i w:val="0"/>
+          <w:sz w:val="21"/>
+        </w:rPr>
+        <w:t>Stehen oft am Anfang einer Immobilienentscheidung und empfehlen weiter. Wenn Roger als regionale Adresse sichtbar ist, kommt Belle Immo über diese Brücke ins Spiel.</w:t>
+      </w:r>
+    </w:p>
+    <w:p>
+      <w:pPr>
+        <w:spacing w:before="280" w:after="60"/>
+      </w:pPr>
+      <w:r>
+        <w:rPr>
+          <w:rFonts w:ascii="Calibri" w:hAnsi="Calibri"/>
+          <w:b/>
+          <w:color w:val="055A8D"/>
+          <w:sz w:val="25"/>
+        </w:rPr>
+        <w:t>Käufer von Wohneigentum</w:t>
+      </w:r>
+    </w:p>
+    <w:p>
+      <w:pPr>
+        <w:spacing w:before="40" w:after="120" w:line="290" w:lineRule="exact"/>
+      </w:pPr>
+      <w:r>
+        <w:rPr>
+          <w:rFonts w:ascii="Calibri" w:hAnsi="Calibri"/>
+          <w:i w:val="0"/>
+          <w:sz w:val="21"/>
+        </w:rPr>
+        <w:t>Zielgruppe für konkrete Projekte (Velara, Affinity, Wangenpark). Motivation: emotional («Wohntraum») plus rationale Fakten. Ansprache: nahbar, Du-Form.</w:t>
+      </w:r>
+    </w:p>
+    <w:p>
+      <w:pPr>
+        <w:spacing w:before="400" w:after="80"/>
+      </w:pPr>
+      <w:r>
+        <w:rPr>
+          <w:rFonts w:ascii="Calibri" w:hAnsi="Calibri"/>
+          <w:b/>
+          <w:color w:val="055A8D"/>
+          <w:sz w:val="34"/>
+        </w:rPr>
+        <w:t>4. Das Ökosystem — nicht fünf Massnahmen, ein System</w:t>
+      </w:r>
+    </w:p>
+    <w:p>
+      <w:pPr>
+        <w:pBdr>
+          <w:bottom w:val="single" w:sz="6" w:space="1" w:color="055a8d"/>
+        </w:pBdr>
+        <w:spacing w:before="80" w:after="120"/>
+      </w:pPr>
+    </w:p>
+    <w:p>
+      <w:pPr>
+        <w:spacing w:before="40" w:after="120" w:line="290" w:lineRule="exact"/>
+      </w:pPr>
+      <w:r>
+        <w:rPr>
+          <w:rFonts w:ascii="Calibri" w:hAnsi="Calibri"/>
+          <w:i w:val="0"/>
+          <w:sz w:val="21"/>
+        </w:rPr>
+        <w:t>Der strategische Kern lautet: Wir bauen kein Content-Programm, sondern ein verzahntes Kommunikationssystem. Jeder Kanal erfüllt eine spezifische Aufgabe — und alle Kanäle verstärken sich gegenseitig. Das ist der eigentliche Mehrwert gegenüber klassischer Social-Media-Arbeit, die Kanäle als separate Massnahmen behandelt.</w:t>
+      </w:r>
+    </w:p>
+    <w:p>
+      <w:pPr>
+        <w:spacing w:before="40" w:after="120" w:line="290" w:lineRule="exact"/>
+      </w:pPr>
+      <w:r>
+        <w:rPr>
+          <w:rFonts w:ascii="Calibri" w:hAnsi="Calibri"/>
+          <w:i/>
+          <w:color w:val="555555"/>
+          <w:sz w:val="21"/>
+        </w:rPr>
+        <w:t>Wie die Kanäle ineinandergreifen:</w:t>
       </w:r>
     </w:p>
     <w:tbl>
@@ -357,31 +643,328 @@
         <w:tblLook w:firstColumn="1" w:firstRow="1" w:lastColumn="0" w:lastRow="0" w:noHBand="0" w:noVBand="1" w:val="04A0"/>
       </w:tblPr>
       <w:tblGrid>
-        <w:gridCol w:w="9066"/>
+        <w:gridCol w:w="1813"/>
+        <w:gridCol w:w="1813"/>
+        <w:gridCol w:w="1813"/>
+        <w:gridCol w:w="1813"/>
+        <w:gridCol w:w="1813"/>
       </w:tblGrid>
       <w:tr>
         <w:tc>
           <w:tcPr>
-            <w:tcW w:type="dxa" w:w="9066"/>
+            <w:tcW w:type="dxa" w:w="1814"/>
             <w:shd w:val="clear" w:color="auto" w:fill="EBF4FA"/>
-            <w:tcBorders>
-              <w:top w:val="single" w:sz="4" w:space="0" w:color="055a8d"/>
-              <w:left w:val="single" w:sz="12" w:space="0" w:color="055a8d"/>
-              <w:bottom w:val="single" w:sz="4" w:space="0" w:color="055a8d"/>
-              <w:right w:val="none" w:sz="0" w:space="0" w:color="auto"/>
-            </w:tcBorders>
           </w:tcPr>
           <w:p>
             <w:pPr>
-              <w:spacing w:before="80" w:after="80"/>
+              <w:spacing w:before="100" w:after="100"/>
+              <w:jc w:val="center"/>
             </w:pPr>
             <w:r>
               <w:rPr>
-                <w:i/>
+                <w:rFonts w:ascii="Calibri" w:hAnsi="Calibri"/>
+                <w:b/>
                 <w:color w:val="055A8D"/>
-                <w:sz w:val="20"/>
+                <w:sz w:val="19"/>
               </w:rPr>
-              <w:t>Leitmotiv: Nicht «schnelle Leads», sondern Top-of-Mind über Jahre.</w:t>
+              <w:t>Print</w:t>
+              <w:br/>
+              <w:t>(Fachartikel)</w:t>
+            </w:r>
+          </w:p>
+        </w:tc>
+        <w:tc>
+          <w:tcPr>
+            <w:tcW w:type="dxa" w:w="1814"/>
+            <w:shd w:val="clear" w:color="auto" w:fill="F5F5F5"/>
+          </w:tcPr>
+          <w:p>
+            <w:pPr>
+              <w:spacing w:before="100" w:after="100"/>
+              <w:jc w:val="center"/>
+            </w:pPr>
+            <w:r>
+              <w:rPr>
+                <w:rFonts w:ascii="Calibri" w:hAnsi="Calibri"/>
+                <w:b/>
+                <w:color w:val="055A8D"/>
+                <w:sz w:val="28"/>
+              </w:rPr>
+              <w:t>→</w:t>
+            </w:r>
+          </w:p>
+        </w:tc>
+        <w:tc>
+          <w:tcPr>
+            <w:tcW w:type="dxa" w:w="1814"/>
+            <w:shd w:val="clear" w:color="auto" w:fill="EBF4FA"/>
+          </w:tcPr>
+          <w:p>
+            <w:pPr>
+              <w:spacing w:before="100" w:after="100"/>
+              <w:jc w:val="center"/>
+            </w:pPr>
+            <w:r>
+              <w:rPr>
+                <w:rFonts w:ascii="Calibri" w:hAnsi="Calibri"/>
+                <w:b/>
+                <w:color w:val="055A8D"/>
+                <w:sz w:val="19"/>
+              </w:rPr>
+              <w:t>LinkedIn</w:t>
+              <w:br/>
+              <w:t>(Expertise)</w:t>
+            </w:r>
+          </w:p>
+        </w:tc>
+        <w:tc>
+          <w:tcPr>
+            <w:tcW w:type="dxa" w:w="1814"/>
+            <w:shd w:val="clear" w:color="auto" w:fill="F5F5F5"/>
+          </w:tcPr>
+          <w:p>
+            <w:pPr>
+              <w:spacing w:before="100" w:after="100"/>
+              <w:jc w:val="center"/>
+            </w:pPr>
+            <w:r>
+              <w:rPr>
+                <w:rFonts w:ascii="Calibri" w:hAnsi="Calibri"/>
+                <w:b/>
+                <w:color w:val="055A8D"/>
+                <w:sz w:val="28"/>
+              </w:rPr>
+              <w:t>→</w:t>
+            </w:r>
+          </w:p>
+        </w:tc>
+        <w:tc>
+          <w:tcPr>
+            <w:tcW w:type="dxa" w:w="1814"/>
+            <w:shd w:val="clear" w:color="auto" w:fill="EBF4FA"/>
+          </w:tcPr>
+          <w:p>
+            <w:pPr>
+              <w:spacing w:before="100" w:after="100"/>
+              <w:jc w:val="center"/>
+            </w:pPr>
+            <w:r>
+              <w:rPr>
+                <w:rFonts w:ascii="Calibri" w:hAnsi="Calibri"/>
+                <w:b/>
+                <w:color w:val="055A8D"/>
+                <w:sz w:val="19"/>
+              </w:rPr>
+              <w:t>Newsletter</w:t>
+              <w:br/>
+              <w:t>(Bindung)</w:t>
+            </w:r>
+          </w:p>
+        </w:tc>
+      </w:tr>
+      <w:tr>
+        <w:tc>
+          <w:tcPr>
+            <w:tcW w:type="dxa" w:w="1814"/>
+            <w:shd w:val="clear" w:color="auto" w:fill="FFFFFF"/>
+          </w:tcPr>
+          <w:p>
+            <w:pPr>
+              <w:spacing w:before="100" w:after="100"/>
+              <w:jc w:val="center"/>
+            </w:pPr>
+            <w:r>
+              <w:rPr>
+                <w:rFonts w:ascii="Calibri" w:hAnsi="Calibri"/>
+                <w:sz w:val="12"/>
+              </w:rPr>
+            </w:r>
+          </w:p>
+        </w:tc>
+        <w:tc>
+          <w:tcPr>
+            <w:tcW w:type="dxa" w:w="1814"/>
+            <w:shd w:val="clear" w:color="auto" w:fill="FFFFFF"/>
+          </w:tcPr>
+          <w:p>
+            <w:pPr>
+              <w:spacing w:before="100" w:after="100"/>
+              <w:jc w:val="center"/>
+            </w:pPr>
+            <w:r>
+              <w:rPr>
+                <w:rFonts w:ascii="Calibri" w:hAnsi="Calibri"/>
+                <w:sz w:val="12"/>
+              </w:rPr>
+              <w:t xml:space="preserve">  </w:t>
+            </w:r>
+          </w:p>
+        </w:tc>
+        <w:tc>
+          <w:tcPr>
+            <w:tcW w:type="dxa" w:w="1814"/>
+            <w:shd w:val="clear" w:color="auto" w:fill="FFFFFF"/>
+          </w:tcPr>
+          <w:p>
+            <w:pPr>
+              <w:spacing w:before="100" w:after="100"/>
+              <w:jc w:val="center"/>
+            </w:pPr>
+            <w:r>
+              <w:rPr>
+                <w:rFonts w:ascii="Calibri" w:hAnsi="Calibri"/>
+                <w:sz w:val="12"/>
+              </w:rPr>
+            </w:r>
+          </w:p>
+        </w:tc>
+        <w:tc>
+          <w:tcPr>
+            <w:tcW w:type="dxa" w:w="1814"/>
+            <w:shd w:val="clear" w:color="auto" w:fill="FFFFFF"/>
+          </w:tcPr>
+          <w:p>
+            <w:pPr>
+              <w:spacing w:before="100" w:after="100"/>
+              <w:jc w:val="center"/>
+            </w:pPr>
+            <w:r>
+              <w:rPr>
+                <w:rFonts w:ascii="Calibri" w:hAnsi="Calibri"/>
+                <w:sz w:val="12"/>
+              </w:rPr>
+              <w:t xml:space="preserve">  </w:t>
+            </w:r>
+          </w:p>
+        </w:tc>
+        <w:tc>
+          <w:tcPr>
+            <w:tcW w:type="dxa" w:w="1814"/>
+            <w:shd w:val="clear" w:color="auto" w:fill="FFFFFF"/>
+          </w:tcPr>
+          <w:p>
+            <w:pPr>
+              <w:spacing w:before="100" w:after="100"/>
+              <w:jc w:val="center"/>
+            </w:pPr>
+            <w:r>
+              <w:rPr>
+                <w:rFonts w:ascii="Calibri" w:hAnsi="Calibri"/>
+                <w:sz w:val="12"/>
+              </w:rPr>
+            </w:r>
+          </w:p>
+        </w:tc>
+      </w:tr>
+      <w:tr>
+        <w:tc>
+          <w:tcPr>
+            <w:tcW w:type="dxa" w:w="1814"/>
+            <w:shd w:val="clear" w:color="auto" w:fill="EBF4FA"/>
+          </w:tcPr>
+          <w:p>
+            <w:pPr>
+              <w:spacing w:before="100" w:after="100"/>
+              <w:jc w:val="center"/>
+            </w:pPr>
+            <w:r>
+              <w:rPr>
+                <w:rFonts w:ascii="Calibri" w:hAnsi="Calibri"/>
+                <w:b/>
+                <w:color w:val="055A8D"/>
+                <w:sz w:val="19"/>
+              </w:rPr>
+              <w:t>Instagram</w:t>
+              <w:br/>
+              <w:t>(Schaufenster)</w:t>
+            </w:r>
+          </w:p>
+        </w:tc>
+        <w:tc>
+          <w:tcPr>
+            <w:tcW w:type="dxa" w:w="1814"/>
+            <w:shd w:val="clear" w:color="auto" w:fill="F5F5F5"/>
+          </w:tcPr>
+          <w:p>
+            <w:pPr>
+              <w:spacing w:before="100" w:after="100"/>
+              <w:jc w:val="center"/>
+            </w:pPr>
+            <w:r>
+              <w:rPr>
+                <w:rFonts w:ascii="Calibri" w:hAnsi="Calibri"/>
+                <w:b/>
+                <w:color w:val="055A8D"/>
+                <w:sz w:val="28"/>
+              </w:rPr>
+              <w:t>→</w:t>
+            </w:r>
+          </w:p>
+        </w:tc>
+        <w:tc>
+          <w:tcPr>
+            <w:tcW w:type="dxa" w:w="1814"/>
+            <w:shd w:val="clear" w:color="auto" w:fill="EBF4FA"/>
+          </w:tcPr>
+          <w:p>
+            <w:pPr>
+              <w:spacing w:before="100" w:after="100"/>
+              <w:jc w:val="center"/>
+            </w:pPr>
+            <w:r>
+              <w:rPr>
+                <w:rFonts w:ascii="Calibri" w:hAnsi="Calibri"/>
+                <w:b/>
+                <w:color w:val="055A8D"/>
+                <w:sz w:val="19"/>
+              </w:rPr>
+              <w:t>Kampagnen</w:t>
+              <w:br/>
+              <w:t>(Funnel)</w:t>
+            </w:r>
+          </w:p>
+        </w:tc>
+        <w:tc>
+          <w:tcPr>
+            <w:tcW w:type="dxa" w:w="1814"/>
+            <w:shd w:val="clear" w:color="auto" w:fill="F5F5F5"/>
+          </w:tcPr>
+          <w:p>
+            <w:pPr>
+              <w:spacing w:before="100" w:after="100"/>
+              <w:jc w:val="center"/>
+            </w:pPr>
+            <w:r>
+              <w:rPr>
+                <w:rFonts w:ascii="Calibri" w:hAnsi="Calibri"/>
+                <w:b/>
+                <w:color w:val="055A8D"/>
+                <w:sz w:val="28"/>
+              </w:rPr>
+              <w:t>→</w:t>
+            </w:r>
+          </w:p>
+        </w:tc>
+        <w:tc>
+          <w:tcPr>
+            <w:tcW w:type="dxa" w:w="1814"/>
+            <w:shd w:val="clear" w:color="auto" w:fill="EBF4FA"/>
+          </w:tcPr>
+          <w:p>
+            <w:pPr>
+              <w:spacing w:before="100" w:after="100"/>
+              <w:jc w:val="center"/>
+            </w:pPr>
+            <w:r>
+              <w:rPr>
+                <w:rFonts w:ascii="Calibri" w:hAnsi="Calibri"/>
+                <w:b/>
+                <w:color w:val="055A8D"/>
+                <w:sz w:val="19"/>
+              </w:rPr>
+              <w:t>Website</w:t>
+              <w:br/>
+              <w:t>(Konversion)</w:t>
             </w:r>
           </w:p>
         </w:tc>
@@ -394,167 +977,27 @@
     </w:p>
     <w:p>
       <w:pPr>
-        <w:spacing w:before="360" w:after="120"/>
+        <w:spacing w:before="40" w:after="120" w:line="290" w:lineRule="exact"/>
       </w:pPr>
       <w:r>
         <w:rPr>
-          <w:b/>
-          <w:color w:val="055A8D"/>
-          <w:sz w:val="36"/>
+          <w:rFonts w:ascii="Calibri" w:hAnsi="Calibri"/>
+          <w:i w:val="0"/>
+          <w:sz w:val="21"/>
         </w:rPr>
-        <w:t>3. Die Zielgruppe</w:t>
+        <w:t>Konkret: Ein Fachartikel im Glattaler wird als LinkedIn-Post aufgegriffen, fliesst als Newsletter-Inhalt weiter und stärkt so Roger Brand als Fachstimme über drei Kanäle gleichzeitig — mit einem einzigen Stück Content. Instagram zeigt parallel die realisierten Projekte und unterstützt die emotionale Vertrauensbildung. Kampagnen füllen den Funnel mit neuen Kontakten, die über den Newsletter langfristig gebunden werden.</w:t>
       </w:r>
     </w:p>
     <w:p>
       <w:pPr>
-        <w:pBdr>
-          <w:bottom w:val="single" w:sz="6" w:space="1" w:color="055a8d"/>
-        </w:pBdr>
-        <w:spacing w:before="40" w:after="120"/>
-      </w:pPr>
-    </w:p>
-    <w:p>
-      <w:pPr>
-        <w:spacing w:before="200" w:after="40"/>
+        <w:spacing w:before="180" w:after="40"/>
       </w:pPr>
       <w:r>
         <w:rPr>
+          <w:rFonts w:ascii="Calibri" w:hAnsi="Calibri"/>
           <w:b/>
-          <w:color w:val="333333"/>
-          <w:sz w:val="22"/>
-        </w:rPr>
-        <w:t>Investoren / Kapitalgeber</w:t>
-      </w:r>
-    </w:p>
-    <w:p>
-      <w:pPr>
-        <w:spacing w:before="40" w:after="120" w:line="280" w:lineRule="exact"/>
-      </w:pPr>
-      <w:r>
-        <w:rPr>
-          <w:i w:val="0"/>
+          <w:color w:val="222222"/>
           <w:sz w:val="21"/>
-        </w:rPr>
-        <w:t>Nicht primär institutionelle Investoren, sondern Unternehmer mit Privatvermögen — die 68 Inhaber im Follower-Kreis sind grösstenteils KMU-Eigner. Ergänzend Family Offices und vermögende Privatpersonen aus dem Grossraum Zürich (80% der Audience). Motivation: solide Rendite, regionaler Bezug, persönliches Vertrauen. Ansprache: Sie, formell, mit Zahlen und Substanz.</w:t>
-      </w:r>
-    </w:p>
-    <w:p>
-      <w:pPr>
-        <w:spacing w:before="200" w:after="40"/>
-      </w:pPr>
-      <w:r>
-        <w:rPr>
-          <w:b/>
-          <w:color w:val="333333"/>
-          <w:sz w:val="22"/>
-        </w:rPr>
-        <w:t>Landeigentümer / Erbengemeinschaften / Landwirte</w:t>
-      </w:r>
-    </w:p>
-    <w:p>
-      <w:pPr>
-        <w:spacing w:before="40" w:after="120" w:line="280" w:lineRule="exact"/>
-      </w:pPr>
-      <w:r>
-        <w:rPr>
-          <w:i w:val="0"/>
-          <w:sz w:val="21"/>
-        </w:rPr>
-        <w:t>Bislang komplett unbespielt auf Social Media. Entscheidet selten spontan — Belle Immo muss als diskrete, regional verankerte Adresse präsent sein, wenn der Moment kommt. Besonders wichtig: offline und über Multiplikatoren erreichbar.</w:t>
-      </w:r>
-    </w:p>
-    <w:p>
-      <w:pPr>
-        <w:spacing w:before="200" w:after="40"/>
-      </w:pPr>
-      <w:r>
-        <w:rPr>
-          <w:b/>
-          <w:color w:val="333333"/>
-          <w:sz w:val="22"/>
-        </w:rPr>
-        <w:t>Multiplikatoren — Treuhänder und Notare</w:t>
-      </w:r>
-    </w:p>
-    <w:p>
-      <w:pPr>
-        <w:spacing w:before="40" w:after="120" w:line="280" w:lineRule="exact"/>
-      </w:pPr>
-      <w:r>
-        <w:rPr>
-          <w:i w:val="0"/>
-          <w:sz w:val="21"/>
-        </w:rPr>
-        <w:t>Stehen oft am Anfang einer Immobilienentscheidung und empfehlen weiter. Wenn Roger als regionale Adresse sichtbar ist, kommt Belle Immo über diese Brücke ins Spiel.</w:t>
-      </w:r>
-    </w:p>
-    <w:p>
-      <w:pPr>
-        <w:spacing w:before="200" w:after="40"/>
-      </w:pPr>
-      <w:r>
-        <w:rPr>
-          <w:b/>
-          <w:color w:val="333333"/>
-          <w:sz w:val="22"/>
-        </w:rPr>
-        <w:t>Käufer von Wohneigentum</w:t>
-      </w:r>
-    </w:p>
-    <w:p>
-      <w:pPr>
-        <w:spacing w:before="40" w:after="120" w:line="280" w:lineRule="exact"/>
-      </w:pPr>
-      <w:r>
-        <w:rPr>
-          <w:i w:val="0"/>
-          <w:sz w:val="21"/>
-        </w:rPr>
-        <w:t>Zielgruppe für konkrete Projekte (Velara, Affinity, Wangenpark). Motivation: emotional («Wohntraum») plus rationale Fakten. Ansprache: nahbar, Du-Form.</w:t>
-      </w:r>
-    </w:p>
-    <w:p>
-      <w:pPr>
-        <w:spacing w:before="360" w:after="120"/>
-      </w:pPr>
-      <w:r>
-        <w:rPr>
-          <w:b/>
-          <w:color w:val="055A8D"/>
-          <w:sz w:val="36"/>
-        </w:rPr>
-        <w:t>4. Wie kommen wir dahin?</w:t>
-      </w:r>
-    </w:p>
-    <w:p>
-      <w:pPr>
-        <w:pBdr>
-          <w:bottom w:val="single" w:sz="6" w:space="1" w:color="055a8d"/>
-        </w:pBdr>
-        <w:spacing w:before="40" w:after="120"/>
-      </w:pPr>
-    </w:p>
-    <w:p>
-      <w:pPr>
-        <w:spacing w:before="40" w:after="120" w:line="280" w:lineRule="exact"/>
-      </w:pPr>
-      <w:r>
-        <w:rPr>
-          <w:i w:val="0"/>
-          <w:sz w:val="21"/>
-        </w:rPr>
-        <w:t>Wir bauen kein Content-Programm, sondern ein System für nachhaltige Sichtbarkeit. Mournival agiert als externe Marketing-Maschinerie, Pam bleibt Marketingleiterin auf Kundenseite, Roger bleibt das Gesicht — mit Alex als Systemarchitekt im Hintergrund.</w:t>
-      </w:r>
-    </w:p>
-    <w:p>
-      <w:pPr>
-        <w:spacing w:before="200" w:after="40"/>
-      </w:pPr>
-      <w:r>
-        <w:rPr>
-          <w:b/>
-          <w:color w:val="333333"/>
-          <w:sz w:val="22"/>
         </w:rPr>
         <w:t>Drei tragende Prinzipien:</w:t>
       </w:r>
@@ -562,111 +1005,95 @@
     <w:p>
       <w:pPr>
         <w:pStyle w:val="ListBullet"/>
-        <w:spacing w:before="20" w:after="60"/>
+        <w:spacing w:before="20" w:after="80"/>
         <w:ind w:left="283"/>
       </w:pPr>
       <w:r>
         <w:rPr>
+          <w:rFonts w:ascii="Calibri" w:hAnsi="Calibri"/>
           <w:b/>
           <w:color w:val="055A8D"/>
           <w:sz w:val="21"/>
         </w:rPr>
-        <w:t xml:space="preserve">1. </w:t>
+        <w:t xml:space="preserve">Sichtbarkeit durch Interaktion, nicht nur durch Posting. </w:t>
       </w:r>
       <w:r>
         <w:rPr>
+          <w:rFonts w:ascii="Calibri" w:hAnsi="Calibri"/>
           <w:sz w:val="21"/>
         </w:rPr>
-        <w:t>Sichtbarkeit durch Interaktion, nicht nur durch Posting.</w:t>
-      </w:r>
-    </w:p>
-    <w:p>
-      <w:pPr>
-        <w:spacing w:before="40" w:after="120" w:line="280" w:lineRule="exact"/>
-      </w:pPr>
-      <w:r>
-        <w:rPr>
-          <w:i w:val="0"/>
-          <w:sz w:val="21"/>
-        </w:rPr>
-        <w:t>Bei 394 Followern ist Reichweite über eigene Posts gedeckelt. Der grösste Hebel ist aktive Präsenz im Netzwerk: Roger kommentiert wöchentlich in fremden Feeds; Alex lädt Rogers Kontakte aktiv zur Belle Immo Seite ein.</w:t>
+        <w:t>Bei 394 Followern ist Reichweite über eigene Posts gedeckelt. Der grösste Hebel ist die aktive Teilnahme an Gesprächen im Netzwerk.</w:t>
       </w:r>
     </w:p>
     <w:p>
       <w:pPr>
         <w:pStyle w:val="ListBullet"/>
-        <w:spacing w:before="20" w:after="60"/>
+        <w:spacing w:before="20" w:after="80"/>
         <w:ind w:left="283"/>
       </w:pPr>
       <w:r>
         <w:rPr>
+          <w:rFonts w:ascii="Calibri" w:hAnsi="Calibri"/>
           <w:b/>
           <w:color w:val="055A8D"/>
           <w:sz w:val="21"/>
         </w:rPr>
-        <w:t xml:space="preserve">2. </w:t>
+        <w:t xml:space="preserve">Jeder Kanal hat eine klar definierte Aufgabe im System. </w:t>
       </w:r>
       <w:r>
         <w:rPr>
+          <w:rFonts w:ascii="Calibri" w:hAnsi="Calibri"/>
           <w:sz w:val="21"/>
         </w:rPr>
-        <w:t>Jeder Kanal hat eine klare Rolle.</w:t>
-      </w:r>
-    </w:p>
-    <w:p>
-      <w:pPr>
-        <w:spacing w:before="40" w:after="120" w:line="280" w:lineRule="exact"/>
-      </w:pPr>
-      <w:r>
-        <w:rPr>
-          <w:i w:val="0"/>
-          <w:sz w:val="21"/>
-        </w:rPr>
-        <w:t>LinkedIn = Expertenpositionierung &amp; Personal Branding. Instagram = digitales Schaufenster. Newsletter = Content-Multiplikator &amp; Bindeglied. Print = offline Verankerung. Kampagnen = konstant Funnel füllen.</w:t>
+        <w:t>LinkedIn = Expertenpositionierung &amp; Personal Branding. Instagram = digitales Schaufenster. Newsletter = Owned Asset &amp; Bindeglied. Print = offline Verankerung. Kampagnen = konstanter Funnel-Eingang.</w:t>
       </w:r>
     </w:p>
     <w:p>
       <w:pPr>
         <w:pStyle w:val="ListBullet"/>
-        <w:spacing w:before="20" w:after="60"/>
+        <w:spacing w:before="20" w:after="80"/>
         <w:ind w:left="283"/>
       </w:pPr>
       <w:r>
         <w:rPr>
+          <w:rFonts w:ascii="Calibri" w:hAnsi="Calibri"/>
           <w:b/>
           <w:color w:val="055A8D"/>
           <w:sz w:val="21"/>
         </w:rPr>
-        <w:t xml:space="preserve">3. </w:t>
+        <w:t xml:space="preserve">Immobilien-Marketing ist Beziehungsaufbau, kein Auto-Verkauf. </w:t>
       </w:r>
       <w:r>
         <w:rPr>
+          <w:rFonts w:ascii="Calibri" w:hAnsi="Calibri"/>
           <w:sz w:val="21"/>
         </w:rPr>
-        <w:t>Immobilien-Marketing ist Beziehungsaufbau, kein Auto-Verkauf.</w:t>
+        <w:t>Kein Modell mit kurzen Conversion-Zyklen. Der erste Investor-Lead aus der laufenden Kampagne bestätigt: das Modell funktioniert — es braucht Zeit und Konsequenz.</w:t>
       </w:r>
     </w:p>
     <w:p>
       <w:pPr>
-        <w:spacing w:before="40" w:after="120" w:line="280" w:lineRule="exact"/>
+        <w:spacing w:before="40" w:after="120" w:line="290" w:lineRule="exact"/>
       </w:pPr>
       <w:r>
         <w:rPr>
+          <w:rFonts w:ascii="Calibri" w:hAnsi="Calibri"/>
           <w:i w:val="0"/>
           <w:sz w:val="21"/>
         </w:rPr>
-        <w:t>Kein Modell mit kurzen Conversion-Zyklen. Newsletter als Zwischenschritt zwischen Reichweite und Anfrage. Der erste Investor-Lead aus der laufenden Kampagne bestätigt: das Modell funktioniert — es braucht Zeit und Konsequenz.</w:t>
+        <w:t>Mournival entwickelt und orchestriert dieses System. Pam bleibt die zentrale Ansprechpartnerin auf Kundenseite und stellt sicher, dass alle Aktivitäten eng mit der Unternehmensstrategie abgestimmt bleiben. Mournival erweitert diese Rolle durch strategische Planung, operative Umsetzung und kontinuierliche Optimierung. Roger bleibt das Gesicht.</w:t>
       </w:r>
     </w:p>
     <w:p>
       <w:pPr>
-        <w:spacing w:before="360" w:after="120"/>
+        <w:spacing w:before="400" w:after="80"/>
       </w:pPr>
       <w:r>
         <w:rPr>
+          <w:rFonts w:ascii="Calibri" w:hAnsi="Calibri"/>
           <w:b/>
           <w:color w:val="055A8D"/>
-          <w:sz w:val="36"/>
+          <w:sz w:val="34"/>
         </w:rPr>
         <w:t>5. Der Funnel</w:t>
       </w:r>
@@ -676,15 +1103,16 @@
         <w:pBdr>
           <w:bottom w:val="single" w:sz="6" w:space="1" w:color="055a8d"/>
         </w:pBdr>
-        <w:spacing w:before="40" w:after="120"/>
+        <w:spacing w:before="80" w:after="120"/>
       </w:pPr>
     </w:p>
     <w:p>
       <w:pPr>
-        <w:spacing w:before="40" w:after="120" w:line="280" w:lineRule="exact"/>
+        <w:spacing w:before="40" w:after="120" w:line="290" w:lineRule="exact"/>
       </w:pPr>
       <w:r>
         <w:rPr>
+          <w:rFonts w:ascii="Calibri" w:hAnsi="Calibri"/>
           <w:i w:val="0"/>
           <w:sz w:val="21"/>
         </w:rPr>
@@ -693,48 +1121,52 @@
     </w:p>
     <w:p>
       <w:pPr>
-        <w:spacing w:before="200" w:after="40"/>
+        <w:spacing w:before="280" w:after="60"/>
       </w:pPr>
       <w:r>
         <w:rPr>
+          <w:rFonts w:ascii="Calibri" w:hAnsi="Calibri"/>
           <w:b/>
-          <w:color w:val="333333"/>
-          <w:sz w:val="22"/>
+          <w:color w:val="055A8D"/>
+          <w:sz w:val="25"/>
         </w:rPr>
         <w:t>Awareness — gesehen werden</w:t>
       </w:r>
     </w:p>
     <w:p>
       <w:pPr>
-        <w:spacing w:before="40" w:after="120" w:line="280" w:lineRule="exact"/>
+        <w:spacing w:before="40" w:after="120" w:line="290" w:lineRule="exact"/>
       </w:pPr>
       <w:r>
         <w:rPr>
+          <w:rFonts w:ascii="Calibri" w:hAnsi="Calibri"/>
           <w:i w:val="0"/>
           <w:sz w:val="21"/>
         </w:rPr>
-        <w:t>Roger und Belle Immo werden durch wöchentliches Community Management (Kommentare in fremden Feeds), reichweitenstarke Posts, gezielte Einladungen von Rogers Kontakten durch Alex sowie Kampagnen präsent. Instagram-Ästhetik und regionale Fachartikel zahlen ebenfalls hier ein.</w:t>
+        <w:t>Roger und Belle Immo werden durch wöchentliches Community Management, reichweitenstarke Posts, gezielte Einladungen von Rogers Kontakten durch Alex sowie Kampagnen präsent. Instagram-Ästhetik und regionale Fachartikel zahlen ebenfalls hier ein.</w:t>
       </w:r>
     </w:p>
     <w:p>
       <w:pPr>
-        <w:spacing w:before="200" w:after="40"/>
+        <w:spacing w:before="280" w:after="60"/>
       </w:pPr>
       <w:r>
         <w:rPr>
+          <w:rFonts w:ascii="Calibri" w:hAnsi="Calibri"/>
           <w:b/>
-          <w:color w:val="333333"/>
-          <w:sz w:val="22"/>
+          <w:color w:val="055A8D"/>
+          <w:sz w:val="25"/>
         </w:rPr>
         <w:t>Interesse — als Experte überzeugen</w:t>
       </w:r>
     </w:p>
     <w:p>
       <w:pPr>
-        <w:spacing w:before="40" w:after="120" w:line="280" w:lineRule="exact"/>
+        <w:spacing w:before="40" w:after="120" w:line="290" w:lineRule="exact"/>
       </w:pPr>
       <w:r>
         <w:rPr>
+          <w:rFonts w:ascii="Calibri" w:hAnsi="Calibri"/>
           <w:i w:val="0"/>
           <w:sz w:val="21"/>
         </w:rPr>
@@ -743,48 +1175,52 @@
     </w:p>
     <w:p>
       <w:pPr>
-        <w:spacing w:before="200" w:after="40"/>
+        <w:spacing w:before="280" w:after="60"/>
       </w:pPr>
       <w:r>
         <w:rPr>
+          <w:rFonts w:ascii="Calibri" w:hAnsi="Calibri"/>
           <w:b/>
-          <w:color w:val="333333"/>
-          <w:sz w:val="22"/>
+          <w:color w:val="055A8D"/>
+          <w:sz w:val="25"/>
         </w:rPr>
         <w:t>Bindung — in der Community bleiben</w:t>
       </w:r>
     </w:p>
     <w:p>
       <w:pPr>
-        <w:spacing w:before="40" w:after="120" w:line="280" w:lineRule="exact"/>
+        <w:spacing w:before="40" w:after="120" w:line="290" w:lineRule="exact"/>
       </w:pPr>
       <w:r>
         <w:rPr>
+          <w:rFonts w:ascii="Calibri" w:hAnsi="Calibri"/>
           <w:i w:val="0"/>
           <w:sz w:val="21"/>
         </w:rPr>
-        <w:t>Der Newsletter überbrückt die langen Entscheidungszyklen der Immobilienwelt. Investor-Direktansprache mit CTA und konkrete Projektangebote führen jene weiter, die bereit sind.</w:t>
+        <w:t>Der Newsletter überbrückt die langen Entscheidungszyklen der Immobilienwelt. Wer noch nicht kaufen oder investieren will, abonniert und bleibt im Kontakt. Investor-Direktansprache mit CTA führt jene weiter, die bereit sind.</w:t>
       </w:r>
     </w:p>
     <w:p>
       <w:pPr>
-        <w:spacing w:before="200" w:after="40"/>
+        <w:spacing w:before="280" w:after="60"/>
       </w:pPr>
       <w:r>
         <w:rPr>
+          <w:rFonts w:ascii="Calibri" w:hAnsi="Calibri"/>
           <w:b/>
-          <w:color w:val="333333"/>
-          <w:sz w:val="22"/>
+          <w:color w:val="055A8D"/>
+          <w:sz w:val="25"/>
         </w:rPr>
         <w:t>Empfehlung / Weiterleitung</w:t>
       </w:r>
     </w:p>
     <w:p>
       <w:pPr>
-        <w:spacing w:before="40" w:after="120" w:line="280" w:lineRule="exact"/>
+        <w:spacing w:before="40" w:after="120" w:line="290" w:lineRule="exact"/>
       </w:pPr>
       <w:r>
         <w:rPr>
+          <w:rFonts w:ascii="Calibri" w:hAnsi="Calibri"/>
           <w:i w:val="0"/>
           <w:sz w:val="21"/>
         </w:rPr>
@@ -807,22 +1243,23 @@
             <w:shd w:val="clear" w:color="auto" w:fill="EBF4FA"/>
             <w:tcBorders>
               <w:top w:val="single" w:sz="4" w:space="0" w:color="055a8d"/>
-              <w:left w:val="single" w:sz="12" w:space="0" w:color="055a8d"/>
+              <w:left w:val="single" w:sz="14" w:space="0" w:color="055a8d"/>
               <w:bottom w:val="single" w:sz="4" w:space="0" w:color="055a8d"/>
               <w:right w:val="none" w:sz="0" w:space="0" w:color="auto"/>
             </w:tcBorders>
           </w:tcPr>
           <w:p>
             <w:pPr>
-              <w:spacing w:before="80" w:after="80"/>
+              <w:spacing w:before="100" w:after="100"/>
             </w:pPr>
             <w:r>
               <w:rPr>
+                <w:rFonts w:ascii="Calibri" w:hAnsi="Calibri"/>
                 <w:i/>
                 <w:color w:val="055A8D"/>
                 <w:sz w:val="20"/>
               </w:rPr>
-              <w:t>Niemand wird «gedrückt». Menschen folgen Belle Immo wegen spannender Projekte und wertvoller Einblicke — wenn die Immobilienentscheidung ansteht, ist Belle Immo bereits Top-of-Mind.</w:t>
+              <w:t>Niemand wird «gedrückt». Menschen folgen Belle Immo wegen spannender Projekte und wertvoller Einblicke — und wenn die Immobilienentscheidung ansteht, ist Belle Immo bereits Top-of-Mind.</w:t>
             </w:r>
           </w:p>
         </w:tc>
@@ -835,13 +1272,14 @@
     </w:p>
     <w:p>
       <w:pPr>
-        <w:spacing w:before="360" w:after="120"/>
+        <w:spacing w:before="400" w:after="80"/>
       </w:pPr>
       <w:r>
         <w:rPr>
+          <w:rFonts w:ascii="Calibri" w:hAnsi="Calibri"/>
           <w:b/>
           <w:color w:val="055A8D"/>
-          <w:sz w:val="36"/>
+          <w:sz w:val="34"/>
         </w:rPr>
         <w:t>6. Die einzelnen Elemente / Kanäle / Ansätze</w:t>
       </w:r>
@@ -851,30 +1289,32 @@
         <w:pBdr>
           <w:bottom w:val="single" w:sz="6" w:space="1" w:color="055a8d"/>
         </w:pBdr>
-        <w:spacing w:before="40" w:after="120"/>
+        <w:spacing w:before="80" w:after="120"/>
       </w:pPr>
     </w:p>
     <w:p>
       <w:pPr>
-        <w:spacing w:before="280" w:after="80"/>
+        <w:spacing w:before="280" w:after="60"/>
       </w:pPr>
       <w:r>
         <w:rPr>
+          <w:rFonts w:ascii="Calibri" w:hAnsi="Calibri"/>
           <w:b/>
           <w:color w:val="055A8D"/>
-          <w:sz w:val="26"/>
+          <w:sz w:val="25"/>
         </w:rPr>
         <w:t>LinkedIn — Social Media Posting</w:t>
       </w:r>
     </w:p>
     <w:p>
       <w:pPr>
-        <w:spacing w:before="0" w:after="80"/>
+        <w:spacing w:before="40" w:after="120" w:line="290" w:lineRule="exact"/>
       </w:pPr>
       <w:r>
         <w:rPr>
+          <w:rFonts w:ascii="Calibri" w:hAnsi="Calibri"/>
           <w:i/>
-          <w:color w:val="666666"/>
+          <w:color w:val="555555"/>
           <w:sz w:val="19"/>
         </w:rPr>
         <w:t>Status: besteht, wird ausgebaut</w:t>
@@ -882,37 +1322,40 @@
     </w:p>
     <w:p>
       <w:pPr>
-        <w:spacing w:before="40" w:after="120" w:line="280" w:lineRule="exact"/>
+        <w:spacing w:before="40" w:after="120" w:line="290" w:lineRule="exact"/>
       </w:pPr>
       <w:r>
         <w:rPr>
+          <w:rFonts w:ascii="Calibri" w:hAnsi="Calibri"/>
           <w:i w:val="0"/>
           <w:sz w:val="21"/>
         </w:rPr>
-        <w:t>Neu: 2 Unternehmensbeiträge pro Woche nach definiertem Content-Mix (~6/Monat): 2× Persönlichkeit/Team mit Roger als Gesicht, 1–2× konkretes Objekt mit Zahlen, 1× Investor-Direktansprache mit CTA, 1× Mehrwert (Wohnpolitik/Markt), 1× Land-Akquise (neu einführen). Damit bespielen wir alle vier strategischen Ziele. Neutrale Partnership-Posts ohne eigene Haltung werden gestrichen (Ø 6% ER vs. 28% ER bei substanziellem Content).</w:t>
+        <w:t>Neu: 2 Unternehmensbeiträge pro Woche nach definiertem Content-Mix (~6/Monat): 2× Persönlichkeit/Team mit Roger als Gesicht, 1–2× konkretes Objekt mit Zahlen, 1× Investor-Direktansprache mit CTA, 1× Mehrwert (Wohnpolitik/Markt), 1× Land-Akquise (neu einführen). Damit bespielen wir alle vier strategischen Ziele. Neutrale Partnership-Posts ohne eigene Haltung werden gestrichen (Ø 6% ER vs. Ø 28% ER bei substanziellem Content).</w:t>
       </w:r>
     </w:p>
     <w:p>
       <w:pPr>
-        <w:spacing w:before="280" w:after="80"/>
+        <w:spacing w:before="280" w:after="60"/>
       </w:pPr>
       <w:r>
         <w:rPr>
+          <w:rFonts w:ascii="Calibri" w:hAnsi="Calibri"/>
           <w:b/>
           <w:color w:val="055A8D"/>
-          <w:sz w:val="26"/>
+          <w:sz w:val="25"/>
         </w:rPr>
         <w:t>LinkedIn — Personal Branding Roger</w:t>
       </w:r>
     </w:p>
     <w:p>
       <w:pPr>
-        <w:spacing w:before="0" w:after="80"/>
+        <w:spacing w:before="40" w:after="120" w:line="290" w:lineRule="exact"/>
       </w:pPr>
       <w:r>
         <w:rPr>
+          <w:rFonts w:ascii="Calibri" w:hAnsi="Calibri"/>
           <w:i/>
-          <w:color w:val="666666"/>
+          <w:color w:val="555555"/>
           <w:sz w:val="19"/>
         </w:rPr>
         <w:t>Status: reaktiviert</w:t>
@@ -920,10 +1363,11 @@
     </w:p>
     <w:p>
       <w:pPr>
-        <w:spacing w:before="40" w:after="120" w:line="280" w:lineRule="exact"/>
+        <w:spacing w:before="40" w:after="120" w:line="290" w:lineRule="exact"/>
       </w:pPr>
       <w:r>
         <w:rPr>
+          <w:rFonts w:ascii="Calibri" w:hAnsi="Calibri"/>
           <w:i w:val="0"/>
           <w:sz w:val="21"/>
         </w:rPr>
@@ -932,66 +1376,187 @@
     </w:p>
     <w:p>
       <w:pPr>
-        <w:spacing w:before="280" w:after="80"/>
+        <w:spacing w:before="280" w:after="60"/>
       </w:pPr>
       <w:r>
         <w:rPr>
+          <w:rFonts w:ascii="Calibri" w:hAnsi="Calibri"/>
           <w:b/>
           <w:color w:val="055A8D"/>
-          <w:sz w:val="26"/>
+          <w:sz w:val="25"/>
         </w:rPr>
-        <w:t>Community Management</w:t>
+        <w:t>Community Management — der Gamechanger</w:t>
       </w:r>
     </w:p>
     <w:p>
       <w:pPr>
-        <w:spacing w:before="0" w:after="80"/>
+        <w:spacing w:before="40" w:after="120" w:line="290" w:lineRule="exact"/>
       </w:pPr>
       <w:r>
         <w:rPr>
+          <w:rFonts w:ascii="Calibri" w:hAnsi="Calibri"/>
           <w:i/>
-          <w:color w:val="666666"/>
+          <w:color w:val="555555"/>
           <w:sz w:val="19"/>
         </w:rPr>
         <w:t>Status: neu — aktiviert</w:t>
       </w:r>
     </w:p>
+    <w:tbl>
+      <w:tblPr>
+        <w:tblStyle w:val="TableGrid"/>
+        <w:tblW w:type="auto" w:w="0"/>
+        <w:tblLook w:firstColumn="1" w:firstRow="1" w:lastColumn="0" w:lastRow="0" w:noHBand="0" w:noVBand="1" w:val="04A0"/>
+      </w:tblPr>
+      <w:tblGrid>
+        <w:gridCol w:w="9066"/>
+      </w:tblGrid>
+      <w:tr>
+        <w:tc>
+          <w:tcPr>
+            <w:tcW w:type="dxa" w:w="9066"/>
+            <w:shd w:val="clear" w:color="auto" w:fill="FFF8E6"/>
+            <w:tcBorders>
+              <w:top w:val="single" w:sz="4" w:space="0" w:color="E8A820"/>
+              <w:left w:val="single" w:sz="14" w:space="0" w:color="E8A820"/>
+              <w:bottom w:val="single" w:sz="4" w:space="0" w:color="E8A820"/>
+              <w:right w:val="single" w:sz="4" w:space="0" w:color="E8A820"/>
+            </w:tcBorders>
+          </w:tcPr>
+          <w:p>
+            <w:pPr>
+              <w:spacing w:before="100" w:after="100"/>
+            </w:pPr>
+            <w:r>
+              <w:rPr>
+                <w:rFonts w:ascii="Calibri" w:hAnsi="Calibri"/>
+                <w:b/>
+                <w:color w:val="B07A00"/>
+                <w:sz w:val="21"/>
+              </w:rPr>
+              <w:t xml:space="preserve">Kernaussage:  </w:t>
+            </w:r>
+            <w:r>
+              <w:rPr>
+                <w:rFonts w:ascii="Calibri" w:hAnsi="Calibri"/>
+                <w:sz w:val="21"/>
+              </w:rPr>
+              <w:t>Community Management ist nicht ein Hebel unter vielen — es ist DER Hebel. Belle Immo nimmt aktiv an Gesprächen teil. Nicht Posting, nicht KI: sondern Präsenz im Netzwerk. Das ist der grösste ungenutzte Wachstumstreiber.</w:t>
+            </w:r>
+          </w:p>
+        </w:tc>
+      </w:tr>
+    </w:tbl>
     <w:p>
       <w:pPr>
-        <w:spacing w:before="40" w:after="120" w:line="280" w:lineRule="exact"/>
+        <w:spacing w:after="80"/>
+      </w:pPr>
+    </w:p>
+    <w:p>
+      <w:pPr>
+        <w:spacing w:before="40" w:after="120" w:line="290" w:lineRule="exact"/>
       </w:pPr>
       <w:r>
         <w:rPr>
+          <w:rFonts w:ascii="Calibri" w:hAnsi="Calibri"/>
           <w:i w:val="0"/>
           <w:sz w:val="21"/>
         </w:rPr>
-        <w:t>Roger kommentiert 1× pro Woche gezielt auf einem relevanten Beitrag (Inhaber/VPs aus dem Follower-Kreis, Bauträger, Architekten, Wohnpolitik-Diskussionen) — substanziell, nicht oberflächlich. KI-Workflow: KI sucht Beiträge → Agent bereitet Kommentarvorschläge auf → Robin prüft und gibt frei → Roger kommentiert.</w:t>
-        <w:br/>
-        <w:br/>
-        <w:t>Parallel dazu übernimmt Alex das aktive Einladen von Rogers LinkedIn-Kontakten zur Belle Immo Unternehmensseite, um Rogers Netzwerk direkt für die Seite nutzbar zu machen.</w:t>
+        <w:t>Roger kommentiert gezielt auf relevanten Beiträgen im Netzwerk — bei Inhabern und VPs aus dem Follower-Kreis, Bauträgern, Architekten und Wohnpolitik-Diskussionen. Substanziell, nicht oberflächlich. Start: 1 qualifizierter Kommentar pro Woche, mit dem Ziel, den Rhythmus schrittweise auf mehrere Interaktionen pro Woche auszubauen.</w:t>
       </w:r>
     </w:p>
     <w:p>
       <w:pPr>
-        <w:spacing w:before="280" w:after="80"/>
+        <w:spacing w:before="40" w:after="120" w:line="290" w:lineRule="exact"/>
       </w:pPr>
       <w:r>
         <w:rPr>
-          <w:b/>
-          <w:color w:val="055A8D"/>
-          <w:sz w:val="26"/>
+          <w:rFonts w:ascii="Calibri" w:hAnsi="Calibri"/>
+          <w:i w:val="0"/>
+          <w:sz w:val="21"/>
         </w:rPr>
-        <w:t>Instagram — Posting</w:t>
+        <w:t>Mournival entwickelt dafür einen Workflow, der es ermöglicht, mit minimalem Zeitaufwand konstant sichtbar zu bleiben. Wie das intern funktioniert, ist Mournivalsache — Roger sieht fertige Vorschläge und gibt sie mit einem Klick frei.</w:t>
       </w:r>
     </w:p>
     <w:p>
       <w:pPr>
-        <w:spacing w:before="0" w:after="80"/>
+        <w:spacing w:before="40" w:after="120" w:line="290" w:lineRule="exact"/>
       </w:pPr>
       <w:r>
         <w:rPr>
+          <w:rFonts w:ascii="Calibri" w:hAnsi="Calibri"/>
+          <w:i w:val="0"/>
+          <w:sz w:val="21"/>
+        </w:rPr>
+        <w:t>Parallel dazu übernimmt Alex das aktive Einladen von Rogers LinkedIn-Kontakten zur Belle Immo Unternehmensseite, um Rogers bestehendes Netzwerk direkt für die Seite nutzbar zu machen.</w:t>
+      </w:r>
+    </w:p>
+    <w:tbl>
+      <w:tblPr>
+        <w:tblStyle w:val="TableGrid"/>
+        <w:tblW w:type="auto" w:w="0"/>
+        <w:tblLook w:firstColumn="1" w:firstRow="1" w:lastColumn="0" w:lastRow="0" w:noHBand="0" w:noVBand="1" w:val="04A0"/>
+      </w:tblPr>
+      <w:tblGrid>
+        <w:gridCol w:w="9066"/>
+      </w:tblGrid>
+      <w:tr>
+        <w:tc>
+          <w:tcPr>
+            <w:tcW w:type="dxa" w:w="9066"/>
+            <w:shd w:val="clear" w:color="auto" w:fill="EBF4FA"/>
+            <w:tcBorders>
+              <w:top w:val="single" w:sz="4" w:space="0" w:color="055a8d"/>
+              <w:left w:val="single" w:sz="14" w:space="0" w:color="055a8d"/>
+              <w:bottom w:val="single" w:sz="4" w:space="0" w:color="055a8d"/>
+              <w:right w:val="none" w:sz="0" w:space="0" w:color="auto"/>
+            </w:tcBorders>
+          </w:tcPr>
+          <w:p>
+            <w:pPr>
+              <w:spacing w:before="100" w:after="100"/>
+            </w:pPr>
+            <w:r>
+              <w:rPr>
+                <w:rFonts w:ascii="Calibri" w:hAnsi="Calibri"/>
+                <w:i/>
+                <w:color w:val="055A8D"/>
+                <w:sz w:val="20"/>
+              </w:rPr>
+              <w:t>LinkedIn belohnt Kommentare und externe Interaktion massiv stärker als Likes. Wenig Gespräche → wenig Reichweite → wenig neue Follower. Wer nicht in fremden Kommentarspalten auftaucht, wird nicht entdeckt.</w:t>
+            </w:r>
+          </w:p>
+        </w:tc>
+      </w:tr>
+    </w:tbl>
+    <w:p>
+      <w:pPr>
+        <w:spacing w:after="80"/>
+      </w:pPr>
+    </w:p>
+    <w:p>
+      <w:pPr>
+        <w:spacing w:before="280" w:after="60"/>
+      </w:pPr>
+      <w:r>
+        <w:rPr>
+          <w:rFonts w:ascii="Calibri" w:hAnsi="Calibri"/>
+          <w:b/>
+          <w:color w:val="055A8D"/>
+          <w:sz w:val="25"/>
+        </w:rPr>
+        <w:t>Instagram — das digitale Schaufenster</w:t>
+      </w:r>
+    </w:p>
+    <w:p>
+      <w:pPr>
+        <w:spacing w:before="40" w:after="120" w:line="290" w:lineRule="exact"/>
+      </w:pPr>
+      <w:r>
+        <w:rPr>
+          <w:rFonts w:ascii="Calibri" w:hAnsi="Calibri"/>
           <w:i/>
-          <w:color w:val="666666"/>
+          <w:color w:val="555555"/>
           <w:sz w:val="19"/>
         </w:rPr>
         <w:t>Status: besteht, wird neu ausgerichtet</w:t>
@@ -999,37 +1564,40 @@
     </w:p>
     <w:p>
       <w:pPr>
-        <w:spacing w:before="40" w:after="120" w:line="280" w:lineRule="exact"/>
+        <w:spacing w:before="40" w:after="120" w:line="290" w:lineRule="exact"/>
       </w:pPr>
       <w:r>
         <w:rPr>
+          <w:rFonts w:ascii="Calibri" w:hAnsi="Calibri"/>
           <w:i w:val="0"/>
           <w:sz w:val="21"/>
         </w:rPr>
-        <w:t>Positionierung als digitales Schaufenster, nicht als Reichweitenkanal. Hochwertiger, ästhetischer Feed mit realisierten Projekten, Tipps rund um Verkauf/Kauf/Landentwicklung/Bauen sowie dauerhaft zugängliche Podcast-Folgen über Story-Highlights. Instagram beweist Qualität und schafft Vertrauen.</w:t>
+        <w:t>Instagram ist kein Reichweitenkanal — es ist das digitale Schaufenster von Belle Immo. Hochwertiger, ästhetischer Feed mit realisierten Projekten, Tipps rund um Verkauf/Kauf/Landentwicklung/Bauen sowie dauerhaft zugängliche Podcast-Folgen über Story-Highlights. Instagram beweist Qualität und schafft Vertrauen — es bedient die emotionale Käuferseite des Funnels.</w:t>
       </w:r>
     </w:p>
     <w:p>
       <w:pPr>
-        <w:spacing w:before="280" w:after="80"/>
+        <w:spacing w:before="280" w:after="60"/>
       </w:pPr>
       <w:r>
         <w:rPr>
+          <w:rFonts w:ascii="Calibri" w:hAnsi="Calibri"/>
           <w:b/>
           <w:color w:val="055A8D"/>
-          <w:sz w:val="26"/>
+          <w:sz w:val="25"/>
         </w:rPr>
         <w:t>Social Media Ads / Kampagnen</w:t>
       </w:r>
     </w:p>
     <w:p>
       <w:pPr>
-        <w:spacing w:before="0" w:after="80"/>
+        <w:spacing w:before="40" w:after="120" w:line="290" w:lineRule="exact"/>
       </w:pPr>
       <w:r>
         <w:rPr>
+          <w:rFonts w:ascii="Calibri" w:hAnsi="Calibri"/>
           <w:i/>
-          <w:color w:val="666666"/>
+          <w:color w:val="555555"/>
           <w:sz w:val="19"/>
         </w:rPr>
         <w:t>Status: besteht, wird optimiert</w:t>
@@ -1037,75 +1605,131 @@
     </w:p>
     <w:p>
       <w:pPr>
-        <w:spacing w:before="40" w:after="120" w:line="280" w:lineRule="exact"/>
+        <w:spacing w:before="40" w:after="120" w:line="290" w:lineRule="exact"/>
       </w:pPr>
       <w:r>
         <w:rPr>
+          <w:rFonts w:ascii="Calibri" w:hAnsi="Calibri"/>
           <w:i w:val="0"/>
           <w:sz w:val="21"/>
         </w:rPr>
-        <w:t>Mindestens eine Kampagne dauerhaft aktiv mit drei möglichen Zielen: Lead-Generierung, Sichtbarkeit/Reichweite und Newsletter-Community-Aufbau. Die laufende Investor-Kampagne (ab CHF 200'000.-) hat bereits eine erste Conversion erzielt — ein konkreter Interessent. Frühe Kennzahlen aus Woche 1 (CTR 0.35%) sind nicht repräsentativ für die Gesamtkampagne. Langfristige Bindung über den Newsletter als Zwischenschritt — kein Modell mit kurzem Conversion-Zyklus.</w:t>
+        <w:t>Mindestens eine Kampagne dauerhaft aktiv mit drei möglichen Zielen: Lead-Generierung, Sichtbarkeit/Reichweite und Newsletter-Community-Aufbau. Die laufende Investor-Kampagne (ab CHF 200'000.-) hat bereits eine erste Conversion erzielt — ein konkreter Interessent. Die frühen Kennzahlen aus Woche 1 sind nicht repräsentativ für die Gesamtkampagne. Kein Modell mit kurzem Conversion-Zyklus: langfristige Bindung über den Newsletter als Zwischenschritt.</w:t>
       </w:r>
     </w:p>
     <w:p>
       <w:pPr>
-        <w:spacing w:before="280" w:after="80"/>
+        <w:spacing w:before="280" w:after="60"/>
       </w:pPr>
       <w:r>
         <w:rPr>
+          <w:rFonts w:ascii="Calibri" w:hAnsi="Calibri"/>
           <w:b/>
           <w:color w:val="055A8D"/>
-          <w:sz w:val="26"/>
+          <w:sz w:val="25"/>
         </w:rPr>
-        <w:t>Newsletter</w:t>
+        <w:t>Newsletter — das einzige Asset, das Belle Immo gehört</w:t>
       </w:r>
     </w:p>
     <w:p>
       <w:pPr>
-        <w:spacing w:before="0" w:after="80"/>
+        <w:spacing w:before="40" w:after="120" w:line="290" w:lineRule="exact"/>
       </w:pPr>
       <w:r>
         <w:rPr>
+          <w:rFonts w:ascii="Calibri" w:hAnsi="Calibri"/>
           <w:i/>
-          <w:color w:val="666666"/>
+          <w:color w:val="555555"/>
           <w:sz w:val="19"/>
         </w:rPr>
-        <w:t>Status: neu — Content-Multiplikator</w:t>
+        <w:t>Status: neu — das wichtigste Asset</w:t>
+      </w:r>
+    </w:p>
+    <w:tbl>
+      <w:tblPr>
+        <w:tblStyle w:val="TableGrid"/>
+        <w:tblW w:type="auto" w:w="0"/>
+        <w:tblLook w:firstColumn="1" w:firstRow="1" w:lastColumn="0" w:lastRow="0" w:noHBand="0" w:noVBand="1" w:val="04A0"/>
+      </w:tblPr>
+      <w:tblGrid>
+        <w:gridCol w:w="9066"/>
+      </w:tblGrid>
+      <w:tr>
+        <w:tc>
+          <w:tcPr>
+            <w:tcW w:type="dxa" w:w="9066"/>
+            <w:shd w:val="clear" w:color="auto" w:fill="FFF8E6"/>
+            <w:tcBorders>
+              <w:top w:val="single" w:sz="4" w:space="0" w:color="E8A820"/>
+              <w:left w:val="single" w:sz="14" w:space="0" w:color="E8A820"/>
+              <w:bottom w:val="single" w:sz="4" w:space="0" w:color="E8A820"/>
+              <w:right w:val="single" w:sz="4" w:space="0" w:color="E8A820"/>
+            </w:tcBorders>
+          </w:tcPr>
+          <w:p>
+            <w:pPr>
+              <w:spacing w:before="100" w:after="100"/>
+            </w:pPr>
+            <w:r>
+              <w:rPr>
+                <w:rFonts w:ascii="Calibri" w:hAnsi="Calibri"/>
+                <w:b/>
+                <w:color w:val="B07A00"/>
+                <w:sz w:val="21"/>
+              </w:rPr>
+              <w:t xml:space="preserve">Kernaussage:  </w:t>
+            </w:r>
+            <w:r>
+              <w:rPr>
+                <w:rFonts w:ascii="Calibri" w:hAnsi="Calibri"/>
+                <w:sz w:val="21"/>
+              </w:rPr>
+              <w:t>Social Media gehört Meta. LinkedIn gehört Microsoft. Der Newsletter gehört Belle Immo. Ziel ist es, langfristig eine eigene Community aufzubauen, die Belle Immo unabhängig von Algorithmen regelmässig erreicht. Das ist strategisch der wertvollste Kanal, den wir aufbauen.</w:t>
+            </w:r>
+          </w:p>
+        </w:tc>
+      </w:tr>
+    </w:tbl>
+    <w:p>
+      <w:pPr>
+        <w:spacing w:after="80"/>
+      </w:pPr>
+    </w:p>
+    <w:p>
+      <w:pPr>
+        <w:spacing w:before="40" w:after="120" w:line="290" w:lineRule="exact"/>
+      </w:pPr>
+      <w:r>
+        <w:rPr>
+          <w:rFonts w:ascii="Calibri" w:hAnsi="Calibri"/>
+          <w:i w:val="0"/>
+          <w:sz w:val="21"/>
+        </w:rPr>
+        <w:t>Inhalte werden mehrfach verwertet: Newsletter → LinkedIn → Print. So multipliziert jeder produzierte Inhalt seine Wirkung über alle Kanäle. Strategisch ist der Newsletter der entscheidende Zwischenschritt zwischen Reichweite und Anfrage — er hält Interessenten über die langen Immobilien-Entscheidungszyklen gebunden. Kampagnen können gezielt auf Newsletter-Abonnenten optimiert werden, was langfristig die Abhängigkeit von bezahlter Reichweite reduziert.</w:t>
       </w:r>
     </w:p>
     <w:p>
       <w:pPr>
-        <w:spacing w:before="40" w:after="120" w:line="280" w:lineRule="exact"/>
+        <w:spacing w:before="280" w:after="60"/>
       </w:pPr>
       <w:r>
         <w:rPr>
-          <w:i w:val="0"/>
-          <w:sz w:val="21"/>
-        </w:rPr>
-        <w:t>Inhalte werden mehrfach verwertet: Newsletter → LinkedIn → Print. Strategisch ist der Newsletter der entscheidende Zwischenschritt zwischen Reichweite und Anfrage — er hält Interessenten über die langen Immobilien-Entscheidungszyklen gebunden.</w:t>
-      </w:r>
-    </w:p>
-    <w:p>
-      <w:pPr>
-        <w:spacing w:before="280" w:after="80"/>
-      </w:pPr>
-      <w:r>
-        <w:rPr>
+          <w:rFonts w:ascii="Calibri" w:hAnsi="Calibri"/>
           <w:b/>
           <w:color w:val="055A8D"/>
-          <w:sz w:val="26"/>
+          <w:sz w:val="25"/>
         </w:rPr>
         <w:t>Offline Medien — Fachartikel</w:t>
       </w:r>
     </w:p>
     <w:p>
       <w:pPr>
-        <w:spacing w:before="0" w:after="80"/>
+        <w:spacing w:before="40" w:after="120" w:line="290" w:lineRule="exact"/>
       </w:pPr>
       <w:r>
         <w:rPr>
+          <w:rFonts w:ascii="Calibri" w:hAnsi="Calibri"/>
           <w:i/>
-          <w:color w:val="666666"/>
+          <w:color w:val="555555"/>
           <w:sz w:val="19"/>
         </w:rPr>
         <w:t>Status: neu</w:t>
@@ -1113,27 +1737,29 @@
     </w:p>
     <w:p>
       <w:pPr>
-        <w:spacing w:before="40" w:after="120" w:line="280" w:lineRule="exact"/>
+        <w:spacing w:before="40" w:after="120" w:line="290" w:lineRule="exact"/>
       </w:pPr>
       <w:r>
         <w:rPr>
+          <w:rFonts w:ascii="Calibri" w:hAnsi="Calibri"/>
           <w:i w:val="0"/>
           <w:sz w:val="21"/>
         </w:rPr>
-        <w:t>Regelmässige Fachartikel in regionalen Zeitungen und Fachpublikationen verankern die Expertenpositionierung offline und langfristig. Erreicht Zielgruppen, die nicht primär digital sind (ältere Landeigentümer, Erbengemeinschaften, institutionelle Entscheider).</w:t>
+        <w:t>Regelmässige Fachartikel in regionalen Zeitungen und Fachpublikationen verankern die Expertenpositionierung offline und langfristig — und erreichen Zielgruppen, die nicht primär digital sind: ältere Landeigentümer, Erbengemeinschaften, institutionelle Entscheider, Treuhänder und Notare.</w:t>
       </w:r>
     </w:p>
     <w:p>
       <w:pPr>
-        <w:spacing w:before="200" w:after="40"/>
+        <w:spacing w:before="180" w:after="40"/>
       </w:pPr>
       <w:r>
         <w:rPr>
+          <w:rFonts w:ascii="Calibri" w:hAnsi="Calibri"/>
           <w:b/>
-          <w:color w:val="333333"/>
-          <w:sz w:val="22"/>
+          <w:color w:val="222222"/>
+          <w:sz w:val="21"/>
         </w:rPr>
-        <w:t>Empfohlene Publikationen für Fachartikel</w:t>
+        <w:t>Empfohlene Publikationen:</w:t>
       </w:r>
     </w:p>
     <w:tbl>
@@ -1152,8 +1778,8 @@
       <w:tr>
         <w:tc>
           <w:tcPr>
-            <w:tcW w:type="dxa" w:w="680"/>
-            <w:shd w:val="clear" w:color="auto" w:fill="055a8d"/>
+            <w:tcW w:type="dxa" w:w="624"/>
+            <w:shd w:val="clear" w:color="auto" w:fill="033d62"/>
           </w:tcPr>
           <w:p>
             <w:pPr>
@@ -1173,7 +1799,7 @@
         <w:tc>
           <w:tcPr>
             <w:tcW w:type="dxa" w:w="2268"/>
-            <w:shd w:val="clear" w:color="auto" w:fill="055a8d"/>
+            <w:shd w:val="clear" w:color="auto" w:fill="033d62"/>
           </w:tcPr>
           <w:p>
             <w:pPr>
@@ -1192,8 +1818,8 @@
         </w:tc>
         <w:tc>
           <w:tcPr>
-            <w:tcW w:type="dxa" w:w="3515"/>
-            <w:shd w:val="clear" w:color="auto" w:fill="055a8d"/>
+            <w:tcW w:type="dxa" w:w="3402"/>
+            <w:shd w:val="clear" w:color="auto" w:fill="033d62"/>
           </w:tcPr>
           <w:p>
             <w:pPr>
@@ -1213,7 +1839,7 @@
         <w:tc>
           <w:tcPr>
             <w:tcW w:type="dxa" w:w="1587"/>
-            <w:shd w:val="clear" w:color="auto" w:fill="055a8d"/>
+            <w:shd w:val="clear" w:color="auto" w:fill="033d62"/>
           </w:tcPr>
           <w:p>
             <w:pPr>
@@ -1232,8 +1858,8 @@
         </w:tc>
         <w:tc>
           <w:tcPr>
-            <w:tcW w:type="dxa" w:w="1984"/>
-            <w:shd w:val="clear" w:color="auto" w:fill="055a8d"/>
+            <w:tcW w:type="dxa" w:w="2041"/>
+            <w:shd w:val="clear" w:color="auto" w:fill="033d62"/>
           </w:tcPr>
           <w:p>
             <w:pPr>
@@ -1246,7 +1872,7 @@
                 <w:color w:val="FFFFFF"/>
                 <w:sz w:val="18"/>
               </w:rPr>
-              <w:t>Kontakt</w:t>
+              <w:t>Website</w:t>
             </w:r>
           </w:p>
         </w:tc>
@@ -1254,7 +1880,7 @@
       <w:tr>
         <w:tc>
           <w:tcPr>
-            <w:tcW w:type="dxa" w:w="680"/>
+            <w:tcW w:type="dxa" w:w="624"/>
             <w:shd w:val="clear" w:color="auto" w:fill="E8F4FB"/>
           </w:tcPr>
           <w:p>
@@ -1292,7 +1918,7 @@
         </w:tc>
         <w:tc>
           <w:tcPr>
-            <w:tcW w:type="dxa" w:w="3515"/>
+            <w:tcW w:type="dxa" w:w="3402"/>
             <w:shd w:val="clear" w:color="auto" w:fill="E8F4FB"/>
           </w:tcPr>
           <w:p>
@@ -1304,7 +1930,7 @@
                 <w:rFonts w:ascii="Calibri" w:hAnsi="Calibri"/>
                 <w:sz w:val="18"/>
               </w:rPr>
-              <w:t>Lokale Haushalte Dübendorf/Schwerzenbach/Fällanden — kostenlos, 28'000 Haushalte</w:t>
+              <w:t>Dübendorf/Schwerzenbach/Fällanden — 28'000 Haushalte kostenlos</w:t>
             </w:r>
           </w:p>
         </w:tc>
@@ -1322,13 +1948,13 @@
                 <w:rFonts w:ascii="Calibri" w:hAnsi="Calibri"/>
                 <w:sz w:val="18"/>
               </w:rPr>
-              <w:t>Wöchentlich (freitags)</w:t>
+              <w:t>Wöchentlich (Fr.)</w:t>
             </w:r>
           </w:p>
         </w:tc>
         <w:tc>
           <w:tcPr>
-            <w:tcW w:type="dxa" w:w="1984"/>
+            <w:tcW w:type="dxa" w:w="2041"/>
             <w:shd w:val="clear" w:color="auto" w:fill="E8F4FB"/>
           </w:tcPr>
           <w:p>
@@ -1340,7 +1966,7 @@
                 <w:rFonts w:ascii="Calibri" w:hAnsi="Calibri"/>
                 <w:sz w:val="18"/>
               </w:rPr>
-              <w:t>zo-medien.ch · +41 44 933 33 33</w:t>
+              <w:t>zo-medien.ch</w:t>
             </w:r>
           </w:p>
         </w:tc>
@@ -1348,7 +1974,7 @@
       <w:tr>
         <w:tc>
           <w:tcPr>
-            <w:tcW w:type="dxa" w:w="680"/>
+            <w:tcW w:type="dxa" w:w="624"/>
             <w:shd w:val="clear" w:color="auto" w:fill="E8F4FB"/>
           </w:tcPr>
           <w:p>
@@ -1386,7 +2012,7 @@
         </w:tc>
         <w:tc>
           <w:tcPr>
-            <w:tcW w:type="dxa" w:w="3515"/>
+            <w:tcW w:type="dxa" w:w="3402"/>
             <w:shd w:val="clear" w:color="auto" w:fill="E8F4FB"/>
           </w:tcPr>
           <w:p>
@@ -1398,7 +2024,7 @@
                 <w:rFonts w:ascii="Calibri" w:hAnsi="Calibri"/>
                 <w:sz w:val="18"/>
               </w:rPr>
-              <w:t>Immobilienprofis, Investoren, Entwickler — 15'000 Auflage</w:t>
+              <w:t>Immobilienprofis, Investoren, Entwickler — 15'000 Aufl.</w:t>
             </w:r>
           </w:p>
         </w:tc>
@@ -1422,7 +2048,7 @@
         </w:tc>
         <w:tc>
           <w:tcPr>
-            <w:tcW w:type="dxa" w:w="1984"/>
+            <w:tcW w:type="dxa" w:w="2041"/>
             <w:shd w:val="clear" w:color="auto" w:fill="E8F4FB"/>
           </w:tcPr>
           <w:p>
@@ -1442,7 +2068,7 @@
       <w:tr>
         <w:tc>
           <w:tcPr>
-            <w:tcW w:type="dxa" w:w="680"/>
+            <w:tcW w:type="dxa" w:w="624"/>
             <w:shd w:val="clear" w:color="auto" w:fill="E8F4FB"/>
           </w:tcPr>
           <w:p>
@@ -1480,7 +2106,7 @@
         </w:tc>
         <w:tc>
           <w:tcPr>
-            <w:tcW w:type="dxa" w:w="3515"/>
+            <w:tcW w:type="dxa" w:w="3402"/>
             <w:shd w:val="clear" w:color="auto" w:fill="E8F4FB"/>
           </w:tcPr>
           <w:p>
@@ -1492,7 +2118,7 @@
                 <w:rFonts w:ascii="Calibri" w:hAnsi="Calibri"/>
                 <w:sz w:val="18"/>
               </w:rPr>
-              <w:t>Premiumsegment, Investoren, Architekten — 97'000 Auflage</w:t>
+              <w:t>Premiumsegment, Investoren, Architekten — 97'000 Aufl.</w:t>
             </w:r>
           </w:p>
         </w:tc>
@@ -1516,7 +2142,7 @@
         </w:tc>
         <w:tc>
           <w:tcPr>
-            <w:tcW w:type="dxa" w:w="1984"/>
+            <w:tcW w:type="dxa" w:w="2041"/>
             <w:shd w:val="clear" w:color="auto" w:fill="E8F4FB"/>
           </w:tcPr>
           <w:p>
@@ -1536,7 +2162,7 @@
       <w:tr>
         <w:tc>
           <w:tcPr>
-            <w:tcW w:type="dxa" w:w="680"/>
+            <w:tcW w:type="dxa" w:w="624"/>
             <w:shd w:val="clear" w:color="auto" w:fill="F5F5F5"/>
           </w:tcPr>
           <w:p>
@@ -1566,13 +2192,13 @@
                 <w:rFonts w:ascii="Calibri" w:hAnsi="Calibri"/>
                 <w:sz w:val="18"/>
               </w:rPr>
-              <w:t>Zürcher Oberländer (ZO)</w:t>
+              <w:t>Zürcher Oberländer</w:t>
             </w:r>
           </w:p>
         </w:tc>
         <w:tc>
           <w:tcPr>
-            <w:tcW w:type="dxa" w:w="3515"/>
+            <w:tcW w:type="dxa" w:w="3402"/>
             <w:shd w:val="clear" w:color="auto" w:fill="F5F5F5"/>
           </w:tcPr>
           <w:p>
@@ -1584,7 +2210,7 @@
                 <w:rFonts w:ascii="Calibri" w:hAnsi="Calibri"/>
                 <w:sz w:val="18"/>
               </w:rPr>
-              <w:t>Überregionale Tageszeitung, ~40'000 Leser</w:t>
+              <w:t>Überregionale Tageszeitung, ~40'000 Leser täglich</w:t>
             </w:r>
           </w:p>
         </w:tc>
@@ -1608,7 +2234,7 @@
         </w:tc>
         <w:tc>
           <w:tcPr>
-            <w:tcW w:type="dxa" w:w="1984"/>
+            <w:tcW w:type="dxa" w:w="2041"/>
             <w:shd w:val="clear" w:color="auto" w:fill="F5F5F5"/>
           </w:tcPr>
           <w:p>
@@ -1628,7 +2254,7 @@
       <w:tr>
         <w:tc>
           <w:tcPr>
-            <w:tcW w:type="dxa" w:w="680"/>
+            <w:tcW w:type="dxa" w:w="624"/>
             <w:shd w:val="clear" w:color="auto" w:fill="F5F5F5"/>
           </w:tcPr>
           <w:p>
@@ -1664,7 +2290,7 @@
         </w:tc>
         <w:tc>
           <w:tcPr>
-            <w:tcW w:type="dxa" w:w="3515"/>
+            <w:tcW w:type="dxa" w:w="3402"/>
             <w:shd w:val="clear" w:color="auto" w:fill="F5F5F5"/>
           </w:tcPr>
           <w:p>
@@ -1676,7 +2302,7 @@
                 <w:rFonts w:ascii="Calibri" w:hAnsi="Calibri"/>
                 <w:sz w:val="18"/>
               </w:rPr>
-              <w:t>Fachverband Immobilien CH — Netzwerkeffekt unter Profis</w:t>
+              <w:t>Fachverband CH — Netzwerkeffekt unter Profis</w:t>
             </w:r>
           </w:p>
         </w:tc>
@@ -1700,7 +2326,7 @@
         </w:tc>
         <w:tc>
           <w:tcPr>
-            <w:tcW w:type="dxa" w:w="1984"/>
+            <w:tcW w:type="dxa" w:w="2041"/>
             <w:shd w:val="clear" w:color="auto" w:fill="F5F5F5"/>
           </w:tcPr>
           <w:p>
@@ -1720,7 +2346,7 @@
       <w:tr>
         <w:tc>
           <w:tcPr>
-            <w:tcW w:type="dxa" w:w="680"/>
+            <w:tcW w:type="dxa" w:w="624"/>
             <w:shd w:val="clear" w:color="auto" w:fill="F5F5F5"/>
           </w:tcPr>
           <w:p>
@@ -1756,7 +2382,7 @@
         </w:tc>
         <w:tc>
           <w:tcPr>
-            <w:tcW w:type="dxa" w:w="3515"/>
+            <w:tcW w:type="dxa" w:w="3402"/>
             <w:shd w:val="clear" w:color="auto" w:fill="F5F5F5"/>
           </w:tcPr>
           <w:p>
@@ -1768,7 +2394,7 @@
                 <w:rFonts w:ascii="Calibri" w:hAnsi="Calibri"/>
                 <w:sz w:val="18"/>
               </w:rPr>
-              <w:t>Entscheider &amp; Investoren, Rubrik «Immobilienwirtschaft»</w:t>
+              <w:t>Entscheider &amp; Investoren, Rubrik Immobilienwirtschaft</w:t>
             </w:r>
           </w:p>
         </w:tc>
@@ -1792,7 +2418,7 @@
         </w:tc>
         <w:tc>
           <w:tcPr>
-            <w:tcW w:type="dxa" w:w="1984"/>
+            <w:tcW w:type="dxa" w:w="2041"/>
             <w:shd w:val="clear" w:color="auto" w:fill="F5F5F5"/>
           </w:tcPr>
           <w:p>
@@ -1812,7 +2438,7 @@
       <w:tr>
         <w:tc>
           <w:tcPr>
-            <w:tcW w:type="dxa" w:w="680"/>
+            <w:tcW w:type="dxa" w:w="624"/>
           </w:tcPr>
           <w:p>
             <w:pPr>
@@ -1846,7 +2472,7 @@
         </w:tc>
         <w:tc>
           <w:tcPr>
-            <w:tcW w:type="dxa" w:w="3515"/>
+            <w:tcW w:type="dxa" w:w="3402"/>
           </w:tcPr>
           <w:p>
             <w:pPr>
@@ -1857,7 +2483,7 @@
                 <w:rFonts w:ascii="Calibri" w:hAnsi="Calibri"/>
                 <w:sz w:val="18"/>
               </w:rPr>
-              <w:t>Käufer &amp; Investoren, Online-Portal + Print-Beilage</w:t>
+              <w:t>Käufer &amp; Investoren, Portal + Print</w:t>
             </w:r>
           </w:p>
         </w:tc>
@@ -1880,7 +2506,7 @@
         </w:tc>
         <w:tc>
           <w:tcPr>
-            <w:tcW w:type="dxa" w:w="1984"/>
+            <w:tcW w:type="dxa" w:w="2041"/>
           </w:tcPr>
           <w:p>
             <w:pPr>
@@ -1899,7 +2525,7 @@
       <w:tr>
         <w:tc>
           <w:tcPr>
-            <w:tcW w:type="dxa" w:w="680"/>
+            <w:tcW w:type="dxa" w:w="624"/>
           </w:tcPr>
           <w:p>
             <w:pPr>
@@ -1933,7 +2559,7 @@
         </w:tc>
         <w:tc>
           <w:tcPr>
-            <w:tcW w:type="dxa" w:w="3515"/>
+            <w:tcW w:type="dxa" w:w="3402"/>
           </w:tcPr>
           <w:p>
             <w:pPr>
@@ -1944,7 +2570,7 @@
                 <w:rFonts w:ascii="Calibri" w:hAnsi="Calibri"/>
                 <w:sz w:val="18"/>
               </w:rPr>
-              <w:t>Akademiker, Fachleute — grundsätzliche Marktartikel</w:t>
+              <w:t>Fachleute, grundsätzliche Marktartikel</w:t>
             </w:r>
           </w:p>
         </w:tc>
@@ -1967,7 +2593,7 @@
         </w:tc>
         <w:tc>
           <w:tcPr>
-            <w:tcW w:type="dxa" w:w="1984"/>
+            <w:tcW w:type="dxa" w:w="2041"/>
           </w:tcPr>
           <w:p>
             <w:pPr>
@@ -1987,13 +2613,14 @@
     <w:p/>
     <w:p>
       <w:pPr>
-        <w:spacing w:before="360" w:after="120"/>
+        <w:spacing w:before="400" w:after="80"/>
       </w:pPr>
       <w:r>
         <w:rPr>
+          <w:rFonts w:ascii="Calibri" w:hAnsi="Calibri"/>
           <w:b/>
           <w:color w:val="055A8D"/>
-          <w:sz w:val="36"/>
+          <w:sz w:val="34"/>
         </w:rPr>
         <w:t>7. Fazit — Zusammenspiel, offene Fragen, Entscheidungen</w:t>
       </w:r>
@@ -2003,30 +2630,32 @@
         <w:pBdr>
           <w:bottom w:val="single" w:sz="6" w:space="1" w:color="055a8d"/>
         </w:pBdr>
-        <w:spacing w:before="40" w:after="120"/>
+        <w:spacing w:before="80" w:after="120"/>
       </w:pPr>
     </w:p>
     <w:p>
       <w:pPr>
-        <w:spacing w:before="40" w:after="120" w:line="280" w:lineRule="exact"/>
+        <w:spacing w:before="40" w:after="120" w:line="290" w:lineRule="exact"/>
       </w:pPr>
       <w:r>
         <w:rPr>
+          <w:rFonts w:ascii="Calibri" w:hAnsi="Calibri"/>
           <w:i w:val="0"/>
           <w:sz w:val="21"/>
         </w:rPr>
-        <w:t>Die Elemente greifen ineinander: Community Management und Personal Branding erzeugen Awareness, der Content-Mix und Instagram bauen Vertrauen und Expertise auf, der Newsletter bindet über lange Zyklen, Kampagnen füllen konstant den Funnel, Fachartikel verankern die Position offline. Roger bleibt das Gesicht — Alex und Mournival bauen und orchestrieren das System dahinter.</w:t>
+        <w:t>Die Elemente greifen ineinander zu einer selbsttragenden Sichtbarkeits-Maschine: Community Management und Personal Branding erzeugen Awareness, der Content-Mix und Instagram bauen Vertrauen und Expertise auf, der Newsletter bindet über lange Zyklen, Kampagnen füllen konstant den Funnel, Fachartikel verankern die Position offline. Roger bleibt das Gesicht — Mournival baut und orchestriert das System.</w:t>
       </w:r>
     </w:p>
     <w:p>
       <w:pPr>
-        <w:spacing w:before="200" w:after="40"/>
+        <w:spacing w:before="180" w:after="40"/>
       </w:pPr>
       <w:r>
         <w:rPr>
+          <w:rFonts w:ascii="Calibri" w:hAnsi="Calibri"/>
           <w:b/>
-          <w:color w:val="333333"/>
-          <w:sz w:val="22"/>
+          <w:color w:val="222222"/>
+          <w:sz w:val="21"/>
         </w:rPr>
         <w:t>Offene Fragen und zu treffende Entscheidungen:</w:t>
       </w:r>
@@ -2034,37 +2663,26 @@
     <w:p>
       <w:pPr>
         <w:pStyle w:val="ListBullet"/>
-        <w:spacing w:before="20" w:after="60"/>
+        <w:spacing w:before="20" w:after="80"/>
         <w:ind w:left="283"/>
       </w:pPr>
       <w:r>
         <w:rPr>
+          <w:rFonts w:ascii="Calibri" w:hAnsi="Calibri"/>
           <w:sz w:val="21"/>
         </w:rPr>
-        <w:t>Investor-Kampagne weiterentwickeln: Targeting verfeinern, Learnings aus Woche 1 integrieren, Budget-Allokation überprüfen.</w:t>
+        <w:t>Investor-Kampagne weiterentwickeln: Targeting verfeinern, Learnings integrieren, Budget-Allokation überprüfen.</w:t>
       </w:r>
     </w:p>
     <w:p>
       <w:pPr>
         <w:pStyle w:val="ListBullet"/>
-        <w:spacing w:before="20" w:after="60"/>
+        <w:spacing w:before="20" w:after="80"/>
         <w:ind w:left="283"/>
       </w:pPr>
       <w:r>
         <w:rPr>
-          <w:sz w:val="21"/>
-        </w:rPr>
-        <w:t>KI-Workflow-Setup: Rollen und Freigabeprozess (KI → Agent → Robin → Roger) technisch und prozessual final definieren.</w:t>
-      </w:r>
-    </w:p>
-    <w:p>
-      <w:pPr>
-        <w:pStyle w:val="ListBullet"/>
-        <w:spacing w:before="20" w:after="60"/>
-        <w:ind w:left="283"/>
-      </w:pPr>
-      <w:r>
-        <w:rPr>
+          <w:rFonts w:ascii="Calibri" w:hAnsi="Calibri"/>
           <w:sz w:val="21"/>
         </w:rPr>
         <w:t>Newsletter-Aufsatz: Tooling, Rhythmus und Lead-Magnet für den Aufbau der Abonnenten-Basis bestimmen.</w:t>
@@ -2073,38 +2691,41 @@
     <w:p>
       <w:pPr>
         <w:pStyle w:val="ListBullet"/>
-        <w:spacing w:before="20" w:after="60"/>
+        <w:spacing w:before="20" w:after="80"/>
         <w:ind w:left="283"/>
       </w:pPr>
       <w:r>
         <w:rPr>
+          <w:rFonts w:ascii="Calibri" w:hAnsi="Calibri"/>
           <w:sz w:val="21"/>
         </w:rPr>
-        <w:t>Print-Schiene: Mit welchem Medium und welchem Thema starten wir? Glattaler als lokaler Einstieg oder IMMOBILIEN Business für Fachpublikum?</w:t>
+        <w:t>Print-Schiene: Einstieg mit Glattaler (lokale Reichweite) oder IMMOBILIEN Business (Fachpublikum)?</w:t>
       </w:r>
     </w:p>
     <w:p>
       <w:pPr>
         <w:pStyle w:val="ListBullet"/>
-        <w:spacing w:before="20" w:after="60"/>
+        <w:spacing w:before="20" w:after="80"/>
         <w:ind w:left="283"/>
       </w:pPr>
       <w:r>
         <w:rPr>
+          <w:rFonts w:ascii="Calibri" w:hAnsi="Calibri"/>
           <w:sz w:val="21"/>
         </w:rPr>
-        <w:t>Ressourcen Roger: 1× Woche Community Management plus 1–2 Personal-Posts/Woche verbindlich im Alltag verankern.</w:t>
+        <w:t>Ressourcen Roger: Community Management und Personal Branding-Posts verbindlich im Alltag verankern.</w:t>
       </w:r>
     </w:p>
     <w:p>
       <w:pPr>
-        <w:spacing w:before="360" w:after="120"/>
+        <w:spacing w:before="400" w:after="80"/>
       </w:pPr>
       <w:r>
         <w:rPr>
+          <w:rFonts w:ascii="Calibri" w:hAnsi="Calibri"/>
           <w:b/>
           <w:color w:val="055A8D"/>
-          <w:sz w:val="36"/>
+          <w:sz w:val="34"/>
         </w:rPr>
         <w:t>8. Nächste Schritte</w:t>
       </w:r>
@@ -2114,17 +2735,18 @@
         <w:pBdr>
           <w:bottom w:val="single" w:sz="6" w:space="1" w:color="055a8d"/>
         </w:pBdr>
-        <w:spacing w:before="40" w:after="120"/>
+        <w:spacing w:before="80" w:after="120"/>
       </w:pPr>
     </w:p>
     <w:p>
       <w:pPr>
-        <w:spacing w:before="40" w:after="120" w:line="280" w:lineRule="exact"/>
+        <w:spacing w:before="40" w:after="120" w:line="290" w:lineRule="exact"/>
       </w:pPr>
       <w:r>
         <w:rPr>
+          <w:rFonts w:ascii="Calibri" w:hAnsi="Calibri"/>
           <w:i/>
-          <w:color w:val="666666"/>
+          <w:color w:val="555555"/>
           <w:sz w:val="21"/>
         </w:rPr>
         <w:t>*(Die Offerte wird separat erstellt — hier nur die Massnahmen.)*</w:t>
@@ -2136,14 +2758,16 @@
       </w:pPr>
       <w:r>
         <w:rPr>
+          <w:rFonts w:ascii="Calibri" w:hAnsi="Calibri"/>
           <w:b/>
           <w:color w:val="055A8D"/>
-          <w:sz w:val="22"/>
+          <w:sz w:val="23"/>
         </w:rPr>
         <w:t xml:space="preserve">1.  </w:t>
       </w:r>
       <w:r>
         <w:rPr>
+          <w:rFonts w:ascii="Calibri" w:hAnsi="Calibri"/>
           <w:b/>
           <w:sz w:val="21"/>
         </w:rPr>
@@ -2151,9 +2775,10 @@
       </w:r>
       <w:r>
         <w:rPr>
+          <w:rFonts w:ascii="Calibri" w:hAnsi="Calibri"/>
           <w:sz w:val="21"/>
         </w:rPr>
-        <w:t>Roger: 1× Woche substanzieller Kommentar. Alex: Kontakte zur Belle Immo Seite einladen.</w:t>
+        <w:t>Roger: 1× Woche substanzieller Kommentar, schrittweise auf mehrere/Woche ausbauen. Alex: Kontakte zur Belle Immo Seite einladen.</w:t>
       </w:r>
     </w:p>
     <w:p>
@@ -2162,24 +2787,27 @@
       </w:pPr>
       <w:r>
         <w:rPr>
+          <w:rFonts w:ascii="Calibri" w:hAnsi="Calibri"/>
           <w:b/>
           <w:color w:val="055A8D"/>
-          <w:sz w:val="22"/>
+          <w:sz w:val="23"/>
         </w:rPr>
         <w:t xml:space="preserve">2.  </w:t>
       </w:r>
       <w:r>
         <w:rPr>
+          <w:rFonts w:ascii="Calibri" w:hAnsi="Calibri"/>
           <w:b/>
           <w:sz w:val="21"/>
         </w:rPr>
-        <w:t xml:space="preserve">KI-Workflow aufsetzen — </w:t>
+        <w:t xml:space="preserve">Workflow aufsetzen — </w:t>
       </w:r>
       <w:r>
         <w:rPr>
+          <w:rFonts w:ascii="Calibri" w:hAnsi="Calibri"/>
           <w:sz w:val="21"/>
         </w:rPr>
-        <w:t>Beitrags-Suche, Kommentarvorschläge, Freigabeprozess (Robin → Roger) technisch definieren.</w:t>
+        <w:t>Mournival entwickelt den Prozess, der Roger mit minimalem Aufwand konstant sichtbar hält — fertige Vorschläge, ein Klick zur Freigabe.</w:t>
       </w:r>
     </w:p>
     <w:p>
@@ -2188,14 +2816,16 @@
       </w:pPr>
       <w:r>
         <w:rPr>
+          <w:rFonts w:ascii="Calibri" w:hAnsi="Calibri"/>
           <w:b/>
           <w:color w:val="055A8D"/>
-          <w:sz w:val="22"/>
+          <w:sz w:val="23"/>
         </w:rPr>
         <w:t xml:space="preserve">3.  </w:t>
       </w:r>
       <w:r>
         <w:rPr>
+          <w:rFonts w:ascii="Calibri" w:hAnsi="Calibri"/>
           <w:b/>
           <w:sz w:val="21"/>
         </w:rPr>
@@ -2203,9 +2833,10 @@
       </w:r>
       <w:r>
         <w:rPr>
+          <w:rFonts w:ascii="Calibri" w:hAnsi="Calibri"/>
           <w:sz w:val="21"/>
         </w:rPr>
-        <w:t>LinkedIn ~6 Posts/Monat, neuer Mix mit Land-Akquise und Investor-CTA.</w:t>
+        <w:t>LinkedIn ~6 Posts/Monat, neuer Mix mit Land-Akquise und Investor-CTA. Neutrale Partnership-Posts streichen.</w:t>
       </w:r>
     </w:p>
     <w:p>
@@ -2214,14 +2845,16 @@
       </w:pPr>
       <w:r>
         <w:rPr>
+          <w:rFonts w:ascii="Calibri" w:hAnsi="Calibri"/>
           <w:b/>
           <w:color w:val="055A8D"/>
-          <w:sz w:val="22"/>
+          <w:sz w:val="23"/>
         </w:rPr>
         <w:t xml:space="preserve">4.  </w:t>
       </w:r>
       <w:r>
         <w:rPr>
+          <w:rFonts w:ascii="Calibri" w:hAnsi="Calibri"/>
           <w:b/>
           <w:sz w:val="21"/>
         </w:rPr>
@@ -2229,6 +2862,7 @@
       </w:r>
       <w:r>
         <w:rPr>
+          <w:rFonts w:ascii="Calibri" w:hAnsi="Calibri"/>
           <w:sz w:val="21"/>
         </w:rPr>
         <w:t>Targeting und Budget auf Basis der ersten Conversion optimieren.</w:t>
@@ -2240,14 +2874,16 @@
       </w:pPr>
       <w:r>
         <w:rPr>
+          <w:rFonts w:ascii="Calibri" w:hAnsi="Calibri"/>
           <w:b/>
           <w:color w:val="055A8D"/>
-          <w:sz w:val="22"/>
+          <w:sz w:val="23"/>
         </w:rPr>
         <w:t xml:space="preserve">5.  </w:t>
       </w:r>
       <w:r>
         <w:rPr>
+          <w:rFonts w:ascii="Calibri" w:hAnsi="Calibri"/>
           <w:b/>
           <w:sz w:val="21"/>
         </w:rPr>
@@ -2255,9 +2891,10 @@
       </w:r>
       <w:r>
         <w:rPr>
+          <w:rFonts w:ascii="Calibri" w:hAnsi="Calibri"/>
           <w:sz w:val="21"/>
         </w:rPr>
-        <w:t>Lead-Magnet, Tooling, erster Versand planen.</w:t>
+        <w:t>Lead-Magnet, Tooling, erster Versand planen. Der Aufbau der eigenen Community beginnt hier.</w:t>
       </w:r>
     </w:p>
     <w:p>
@@ -2266,14 +2903,16 @@
       </w:pPr>
       <w:r>
         <w:rPr>
+          <w:rFonts w:ascii="Calibri" w:hAnsi="Calibri"/>
           <w:b/>
           <w:color w:val="055A8D"/>
-          <w:sz w:val="22"/>
+          <w:sz w:val="23"/>
         </w:rPr>
         <w:t xml:space="preserve">6.  </w:t>
       </w:r>
       <w:r>
         <w:rPr>
+          <w:rFonts w:ascii="Calibri" w:hAnsi="Calibri"/>
           <w:b/>
           <w:sz w:val="21"/>
         </w:rPr>
@@ -2281,6 +2920,7 @@
       </w:r>
       <w:r>
         <w:rPr>
+          <w:rFonts w:ascii="Calibri" w:hAnsi="Calibri"/>
           <w:sz w:val="21"/>
         </w:rPr>
         <w:t>Ästhetischer Feed, Projekt-Highlights, Podcast-Integration über Story-Highlights.</w:t>
@@ -2292,14 +2932,16 @@
       </w:pPr>
       <w:r>
         <w:rPr>
+          <w:rFonts w:ascii="Calibri" w:hAnsi="Calibri"/>
           <w:b/>
           <w:color w:val="055A8D"/>
-          <w:sz w:val="22"/>
+          <w:sz w:val="23"/>
         </w:rPr>
         <w:t xml:space="preserve">7.  </w:t>
       </w:r>
       <w:r>
         <w:rPr>
+          <w:rFonts w:ascii="Calibri" w:hAnsi="Calibri"/>
           <w:b/>
           <w:sz w:val="21"/>
         </w:rPr>
@@ -2307,9 +2949,10 @@
       </w:r>
       <w:r>
         <w:rPr>
+          <w:rFonts w:ascii="Calibri" w:hAnsi="Calibri"/>
           <w:sz w:val="21"/>
         </w:rPr>
-        <w:t>Erstgespräch mit Glattaler / ZO; erstes Artikel-Thema definieren.</w:t>
+        <w:t>Erstgespräch mit Glattaler / ZO; erstes Thema definieren.</w:t>
       </w:r>
     </w:p>
     <w:p>
@@ -2318,14 +2961,16 @@
       </w:pPr>
       <w:r>
         <w:rPr>
+          <w:rFonts w:ascii="Calibri" w:hAnsi="Calibri"/>
           <w:b/>
           <w:color w:val="055A8D"/>
-          <w:sz w:val="22"/>
+          <w:sz w:val="23"/>
         </w:rPr>
         <w:t xml:space="preserve">8.  </w:t>
       </w:r>
       <w:r>
         <w:rPr>
+          <w:rFonts w:ascii="Calibri" w:hAnsi="Calibri"/>
           <w:b/>
           <w:sz w:val="21"/>
         </w:rPr>
@@ -2333,6 +2978,7 @@
       </w:r>
       <w:r>
         <w:rPr>
+          <w:rFonts w:ascii="Calibri" w:hAnsi="Calibri"/>
           <w:sz w:val="21"/>
         </w:rPr>
         <w:t>Schrittweise auf 1–2 Posts/Woche, Fokus regionale Fachstimme.</w:t>
@@ -2345,13 +2991,14 @@
     </w:p>
     <w:p>
       <w:pPr>
-        <w:spacing w:before="360" w:after="120"/>
+        <w:spacing w:before="400" w:after="80"/>
       </w:pPr>
       <w:r>
         <w:rPr>
+          <w:rFonts w:ascii="Calibri" w:hAnsi="Calibri"/>
           <w:b/>
           <w:color w:val="055A8D"/>
-          <w:sz w:val="36"/>
+          <w:sz w:val="34"/>
         </w:rPr>
         <w:t>PowerPoint-Snippets</w:t>
       </w:r>
@@ -2361,20 +3008,21 @@
         <w:pBdr>
           <w:bottom w:val="single" w:sz="6" w:space="1" w:color="055a8d"/>
         </w:pBdr>
-        <w:spacing w:before="40" w:after="120"/>
+        <w:spacing w:before="80" w:after="120"/>
       </w:pPr>
     </w:p>
     <w:p>
       <w:pPr>
-        <w:spacing w:before="40" w:after="120" w:line="280" w:lineRule="exact"/>
+        <w:spacing w:before="40" w:after="120" w:line="290" w:lineRule="exact"/>
       </w:pPr>
       <w:r>
         <w:rPr>
+          <w:rFonts w:ascii="Calibri" w:hAnsi="Calibri"/>
           <w:i/>
-          <w:color w:val="666666"/>
+          <w:color w:val="555555"/>
           <w:sz w:val="21"/>
         </w:rPr>
-        <w:t>Folientaugliche Kurzversionen pro Kapitel — bereit für die Präsentation bei Belle Immo AG.</w:t>
+        <w:t>Folientaugliche Kurzversionen — bereit für die Präsentation bei Belle Immo AG.</w:t>
       </w:r>
     </w:p>
     <w:p/>
@@ -2395,21 +3043,199 @@
           </w:tcPr>
           <w:p>
             <w:pPr>
-              <w:spacing w:before="100" w:after="100"/>
+              <w:spacing w:before="120" w:after="120"/>
             </w:pPr>
             <w:r>
               <w:rPr>
+                <w:rFonts w:ascii="Calibri" w:hAnsi="Calibri"/>
                 <w:b/>
-                <w:color w:val="AACCEE"/>
+                <w:color w:val="99BBDD"/>
                 <w:sz w:val="22"/>
               </w:rPr>
               <w:t xml:space="preserve">  01  </w:t>
             </w:r>
             <w:r>
               <w:rPr>
+                <w:rFonts w:ascii="Calibri" w:hAnsi="Calibri"/>
                 <w:b/>
                 <w:color w:val="FFFFFF"/>
-                <w:sz w:val="24"/>
+                <w:sz w:val="25"/>
+              </w:rPr>
+              <w:t>Die Philosophie: Vertrauen vor dem Kauf</w:t>
+            </w:r>
+          </w:p>
+        </w:tc>
+      </w:tr>
+    </w:tbl>
+    <w:tbl>
+      <w:tblPr>
+        <w:tblStyle w:val="TableGrid"/>
+        <w:tblW w:type="auto" w:w="0"/>
+        <w:tblLook w:firstColumn="1" w:firstRow="1" w:lastColumn="0" w:lastRow="0" w:noHBand="0" w:noVBand="1" w:val="04A0"/>
+      </w:tblPr>
+      <w:tblGrid>
+        <w:gridCol w:w="9066"/>
+      </w:tblGrid>
+      <w:tr>
+        <w:tc>
+          <w:tcPr>
+            <w:tcW w:type="dxa" w:w="9066"/>
+            <w:shd w:val="clear" w:color="auto" w:fill="F5FAFD"/>
+            <w:tcBorders>
+              <w:top w:val="none" w:sz="4" w:space="0" w:color="auto"/>
+              <w:left w:val="single" w:sz="4" w:space="0" w:color="055a8d"/>
+              <w:bottom w:val="single" w:sz="4" w:space="0" w:color="CCDDEE"/>
+              <w:right w:val="single" w:sz="4" w:space="0" w:color="CCDDEE"/>
+            </w:tcBorders>
+          </w:tcPr>
+          <w:p/>
+          <w:p>
+            <w:pPr>
+              <w:spacing w:after="60"/>
+            </w:pPr>
+            <w:r>
+              <w:rPr>
+                <w:rFonts w:ascii="Calibri" w:hAnsi="Calibri"/>
+                <w:b/>
+                <w:color w:val="055A8D"/>
+                <w:sz w:val="20"/>
+              </w:rPr>
+              <w:t xml:space="preserve">  →  </w:t>
+            </w:r>
+            <w:r>
+              <w:rPr>
+                <w:rFonts w:ascii="Calibri" w:hAnsi="Calibri"/>
+                <w:sz w:val="20"/>
+              </w:rPr>
+              <w:t>Niemand verkauft nächste Woche sein Haus — niemand sucht heute einen Investor</w:t>
+            </w:r>
+          </w:p>
+          <w:p>
+            <w:pPr>
+              <w:spacing w:before="40" w:after="60"/>
+            </w:pPr>
+            <w:r>
+              <w:rPr>
+                <w:rFonts w:ascii="Calibri" w:hAnsi="Calibri"/>
+                <w:b/>
+                <w:color w:val="055A8D"/>
+                <w:sz w:val="20"/>
+              </w:rPr>
+              <w:t xml:space="preserve">  →  </w:t>
+            </w:r>
+            <w:r>
+              <w:rPr>
+                <w:rFonts w:ascii="Calibri" w:hAnsi="Calibri"/>
+                <w:sz w:val="20"/>
+              </w:rPr>
+              <w:t>Aber wenn dieser Moment kommt: Belle Immo soll bereits bekannt und vertraut sein</w:t>
+            </w:r>
+          </w:p>
+          <w:p>
+            <w:pPr>
+              <w:spacing w:before="40" w:after="60"/>
+            </w:pPr>
+            <w:r>
+              <w:rPr>
+                <w:rFonts w:ascii="Calibri" w:hAnsi="Calibri"/>
+                <w:b/>
+                <w:color w:val="055A8D"/>
+                <w:sz w:val="20"/>
+              </w:rPr>
+              <w:t xml:space="preserve">  →  </w:t>
+            </w:r>
+            <w:r>
+              <w:rPr>
+                <w:rFonts w:ascii="Calibri" w:hAnsi="Calibri"/>
+                <w:sz w:val="20"/>
+              </w:rPr>
+              <w:t>Wir bauen kein Marketing — wir bauen Vertrauen vor dem Kauf</w:t>
+            </w:r>
+          </w:p>
+          <w:p>
+            <w:pPr>
+              <w:spacing w:before="40" w:after="60"/>
+            </w:pPr>
+            <w:r>
+              <w:rPr>
+                <w:rFonts w:ascii="Calibri" w:hAnsi="Calibri"/>
+                <w:b/>
+                <w:color w:val="055A8D"/>
+                <w:sz w:val="20"/>
+              </w:rPr>
+              <w:t xml:space="preserve">  →  </w:t>
+            </w:r>
+            <w:r>
+              <w:rPr>
+                <w:rFonts w:ascii="Calibri" w:hAnsi="Calibri"/>
+                <w:sz w:val="20"/>
+              </w:rPr>
+              <w:t>Das ist der Unterschied zu klassischer Social-Media-Arbeit</w:t>
+            </w:r>
+          </w:p>
+          <w:p>
+            <w:pPr>
+              <w:spacing w:before="40" w:after="60"/>
+            </w:pPr>
+            <w:r>
+              <w:rPr>
+                <w:rFonts w:ascii="Calibri" w:hAnsi="Calibri"/>
+                <w:b/>
+                <w:color w:val="055A8D"/>
+                <w:sz w:val="20"/>
+              </w:rPr>
+              <w:t xml:space="preserve">  →  </w:t>
+            </w:r>
+            <w:r>
+              <w:rPr>
+                <w:rFonts w:ascii="Calibri" w:hAnsi="Calibri"/>
+                <w:sz w:val="20"/>
+              </w:rPr>
+              <w:t>Langfristige Markenverankerung statt kurzfristige Aufmerksamkeit</w:t>
+            </w:r>
+          </w:p>
+        </w:tc>
+      </w:tr>
+    </w:tbl>
+    <w:p>
+      <w:pPr>
+        <w:spacing w:after="120"/>
+      </w:pPr>
+    </w:p>
+    <w:tbl>
+      <w:tblPr>
+        <w:tblStyle w:val="TableGrid"/>
+        <w:tblW w:type="auto" w:w="0"/>
+        <w:tblLook w:firstColumn="1" w:firstRow="1" w:lastColumn="0" w:lastRow="0" w:noHBand="0" w:noVBand="1" w:val="04A0"/>
+      </w:tblPr>
+      <w:tblGrid>
+        <w:gridCol w:w="9066"/>
+      </w:tblGrid>
+      <w:tr>
+        <w:tc>
+          <w:tcPr>
+            <w:tcW w:type="dxa" w:w="9066"/>
+            <w:shd w:val="clear" w:color="auto" w:fill="055a8d"/>
+          </w:tcPr>
+          <w:p>
+            <w:pPr>
+              <w:spacing w:before="120" w:after="120"/>
+            </w:pPr>
+            <w:r>
+              <w:rPr>
+                <w:rFonts w:ascii="Calibri" w:hAnsi="Calibri"/>
+                <w:b/>
+                <w:color w:val="99BBDD"/>
+                <w:sz w:val="22"/>
+              </w:rPr>
+              <w:t xml:space="preserve">  02  </w:t>
+            </w:r>
+            <w:r>
+              <w:rPr>
+                <w:rFonts w:ascii="Calibri" w:hAnsi="Calibri"/>
+                <w:b/>
+                <w:color w:val="FFFFFF"/>
+                <w:sz w:val="25"/>
               </w:rPr>
               <w:t>Ausgangslage</w:t>
             </w:r>
@@ -2445,14 +3271,16 @@
             </w:pPr>
             <w:r>
               <w:rPr>
+                <w:rFonts w:ascii="Calibri" w:hAnsi="Calibri"/>
                 <w:b/>
                 <w:color w:val="055A8D"/>
                 <w:sz w:val="20"/>
               </w:rPr>
-              <w:t xml:space="preserve">  → </w:t>
+              <w:t xml:space="preserve">  →  </w:t>
             </w:r>
             <w:r>
               <w:rPr>
+                <w:rFonts w:ascii="Calibri" w:hAnsi="Calibri"/>
                 <w:sz w:val="20"/>
               </w:rPr>
               <w:t>Gemeinsam aufgebaut: LinkedIn-Präsenz, Content-Rhythmus, erste Kampagnen</w:t>
@@ -2464,14 +3292,16 @@
             </w:pPr>
             <w:r>
               <w:rPr>
+                <w:rFonts w:ascii="Calibri" w:hAnsi="Calibri"/>
                 <w:b/>
                 <w:color w:val="055A8D"/>
                 <w:sz w:val="20"/>
               </w:rPr>
-              <w:t xml:space="preserve">  → </w:t>
+              <w:t xml:space="preserve">  →  </w:t>
             </w:r>
             <w:r>
               <w:rPr>
+                <w:rFonts w:ascii="Calibri" w:hAnsi="Calibri"/>
                 <w:sz w:val="20"/>
               </w:rPr>
               <w:t>Personal Branding paused — läuft jetzt wieder an: Upgrade, kein Neustart</w:t>
@@ -2483,17 +3313,19 @@
             </w:pPr>
             <w:r>
               <w:rPr>
+                <w:rFonts w:ascii="Calibri" w:hAnsi="Calibri"/>
                 <w:b/>
                 <w:color w:val="055A8D"/>
                 <w:sz w:val="20"/>
               </w:rPr>
-              <w:t xml:space="preserve">  → </w:t>
+              <w:t xml:space="preserve">  →  </w:t>
             </w:r>
             <w:r>
               <w:rPr>
+                <w:rFonts w:ascii="Calibri" w:hAnsi="Calibri"/>
                 <w:sz w:val="20"/>
               </w:rPr>
-              <w:t>Content-Qualität top (ER 31–45%), aber Wachstum stagniert (+7 Follower/90 Tage)</w:t>
+              <w:t>Content-Qualität top (ER 31–45%), aber Wachstum stagniert</w:t>
             </w:r>
           </w:p>
           <w:p>
@@ -2502,17 +3334,19 @@
             </w:pPr>
             <w:r>
               <w:rPr>
+                <w:rFonts w:ascii="Calibri" w:hAnsi="Calibri"/>
                 <w:b/>
                 <w:color w:val="055A8D"/>
                 <w:sz w:val="20"/>
               </w:rPr>
-              <w:t xml:space="preserve">  → </w:t>
+              <w:t xml:space="preserve">  →  </w:t>
             </w:r>
             <w:r>
               <w:rPr>
+                <w:rFonts w:ascii="Calibri" w:hAnsi="Calibri"/>
                 <w:sz w:val="20"/>
               </w:rPr>
-              <w:t>3 von 4 strategischen Zielen kaum bespielt (Land: 0 Posts, Investoren: 1 Post)</w:t>
+              <w:t>3 von 4 strategischen Zielen kaum bespielt (Land: 0 Posts)</w:t>
             </w:r>
           </w:p>
           <w:p>
@@ -2521,17 +3355,19 @@
             </w:pPr>
             <w:r>
               <w:rPr>
+                <w:rFonts w:ascii="Calibri" w:hAnsi="Calibri"/>
                 <w:b/>
                 <w:color w:val="055A8D"/>
                 <w:sz w:val="20"/>
               </w:rPr>
-              <w:t xml:space="preserve">  → </w:t>
+              <w:t xml:space="preserve">  →  </w:t>
             </w:r>
             <w:r>
               <w:rPr>
+                <w:rFonts w:ascii="Calibri" w:hAnsi="Calibri"/>
                 <w:sz w:val="20"/>
               </w:rPr>
-              <w:t>Von «einfach posten» → System für nachhaltige Sichtbarkeit</w:t>
+              <w:t>Von «einfach posten» → verzahntes Kommunikationssystem</w:t>
             </w:r>
           </w:p>
         </w:tc>
@@ -2539,7 +3375,7 @@
     </w:tbl>
     <w:p>
       <w:pPr>
-        <w:spacing w:after="80"/>
+        <w:spacing w:after="120"/>
       </w:pPr>
     </w:p>
     <w:tbl>
@@ -2559,23 +3395,25 @@
           </w:tcPr>
           <w:p>
             <w:pPr>
-              <w:spacing w:before="100" w:after="100"/>
+              <w:spacing w:before="120" w:after="120"/>
             </w:pPr>
             <w:r>
               <w:rPr>
+                <w:rFonts w:ascii="Calibri" w:hAnsi="Calibri"/>
                 <w:b/>
-                <w:color w:val="AACCEE"/>
+                <w:color w:val="99BBDD"/>
                 <w:sz w:val="22"/>
               </w:rPr>
-              <w:t xml:space="preserve">  02  </w:t>
+              <w:t xml:space="preserve">  03  </w:t>
             </w:r>
             <w:r>
               <w:rPr>
+                <w:rFonts w:ascii="Calibri" w:hAnsi="Calibri"/>
                 <w:b/>
                 <w:color w:val="FFFFFF"/>
-                <w:sz w:val="24"/>
+                <w:sz w:val="25"/>
               </w:rPr>
-              <w:t>Das Ziel</w:t>
+              <w:t>Das Ziel: Die erste Adresse der Region</w:t>
             </w:r>
           </w:p>
         </w:tc>
@@ -2609,17 +3447,19 @@
             </w:pPr>
             <w:r>
               <w:rPr>
+                <w:rFonts w:ascii="Calibri" w:hAnsi="Calibri"/>
                 <w:b/>
                 <w:color w:val="055A8D"/>
                 <w:sz w:val="20"/>
               </w:rPr>
-              <w:t xml:space="preserve">  → </w:t>
+              <w:t xml:space="preserve">  →  </w:t>
             </w:r>
             <w:r>
               <w:rPr>
+                <w:rFonts w:ascii="Calibri" w:hAnsi="Calibri"/>
                 <w:sz w:val="20"/>
               </w:rPr>
-              <w:t>Belle Immo als DER regionale Anlaufpunkt im Umkreis 10–20 km</w:t>
+              <w:t>Belle Immo wird die erste Adresse für Immobilienfragen im Umkreis 10–20 km</w:t>
             </w:r>
           </w:p>
           <w:p>
@@ -2628,14 +3468,16 @@
             </w:pPr>
             <w:r>
               <w:rPr>
+                <w:rFonts w:ascii="Calibri" w:hAnsi="Calibri"/>
                 <w:b/>
                 <w:color w:val="055A8D"/>
                 <w:sz w:val="20"/>
               </w:rPr>
-              <w:t xml:space="preserve">  → </w:t>
+              <w:t xml:space="preserve">  →  </w:t>
             </w:r>
             <w:r>
               <w:rPr>
+                <w:rFonts w:ascii="Calibri" w:hAnsi="Calibri"/>
                 <w:sz w:val="20"/>
               </w:rPr>
               <w:t>Personal Branding Roger reaktivieren — mit System, nicht spontan</w:t>
@@ -2647,17 +3489,19 @@
             </w:pPr>
             <w:r>
               <w:rPr>
+                <w:rFonts w:ascii="Calibri" w:hAnsi="Calibri"/>
                 <w:b/>
                 <w:color w:val="055A8D"/>
                 <w:sz w:val="20"/>
               </w:rPr>
-              <w:t xml:space="preserve">  → </w:t>
+              <w:t xml:space="preserve">  →  </w:t>
             </w:r>
             <w:r>
               <w:rPr>
+                <w:rFonts w:ascii="Calibri" w:hAnsi="Calibri"/>
                 <w:sz w:val="20"/>
               </w:rPr>
-              <w:t>Community Management starten: Roger 1×/Woche, Alex lädt Kontakte ein</w:t>
+              <w:t>Community Management: Roger 1×/Woche start, Ziel mehrere/Woche</w:t>
             </w:r>
           </w:p>
           <w:p>
@@ -2666,17 +3510,19 @@
             </w:pPr>
             <w:r>
               <w:rPr>
+                <w:rFonts w:ascii="Calibri" w:hAnsi="Calibri"/>
                 <w:b/>
                 <w:color w:val="055A8D"/>
                 <w:sz w:val="20"/>
               </w:rPr>
-              <w:t xml:space="preserve">  → </w:t>
+              <w:t xml:space="preserve">  →  </w:t>
             </w:r>
             <w:r>
               <w:rPr>
+                <w:rFonts w:ascii="Calibri" w:hAnsi="Calibri"/>
                 <w:sz w:val="20"/>
               </w:rPr>
-              <w:t>Newsletter als Bindungskanal über lange Entscheidungszyklen</w:t>
+              <w:t>Newsletter als eigener, algorithmenunabhängiger Kanal</w:t>
             </w:r>
           </w:p>
           <w:p>
@@ -2685,14 +3531,16 @@
             </w:pPr>
             <w:r>
               <w:rPr>
+                <w:rFonts w:ascii="Calibri" w:hAnsi="Calibri"/>
                 <w:b/>
                 <w:color w:val="055A8D"/>
                 <w:sz w:val="20"/>
               </w:rPr>
-              <w:t xml:space="preserve">  → </w:t>
+              <w:t xml:space="preserve">  →  </w:t>
             </w:r>
             <w:r>
               <w:rPr>
+                <w:rFonts w:ascii="Calibri" w:hAnsi="Calibri"/>
                 <w:sz w:val="20"/>
               </w:rPr>
               <w:t>Top-of-Mind über Jahre — nicht schnelle Conversions</w:t>
@@ -2703,7 +3551,7 @@
     </w:tbl>
     <w:p>
       <w:pPr>
-        <w:spacing w:after="80"/>
+        <w:spacing w:after="120"/>
       </w:pPr>
     </w:p>
     <w:tbl>
@@ -2723,23 +3571,25 @@
           </w:tcPr>
           <w:p>
             <w:pPr>
-              <w:spacing w:before="100" w:after="100"/>
+              <w:spacing w:before="120" w:after="120"/>
             </w:pPr>
             <w:r>
               <w:rPr>
+                <w:rFonts w:ascii="Calibri" w:hAnsi="Calibri"/>
                 <w:b/>
-                <w:color w:val="AACCEE"/>
+                <w:color w:val="99BBDD"/>
                 <w:sz w:val="22"/>
               </w:rPr>
-              <w:t xml:space="preserve">  03  </w:t>
+              <w:t xml:space="preserve">  04  </w:t>
             </w:r>
             <w:r>
               <w:rPr>
+                <w:rFonts w:ascii="Calibri" w:hAnsi="Calibri"/>
                 <w:b/>
                 <w:color w:val="FFFFFF"/>
-                <w:sz w:val="24"/>
+                <w:sz w:val="25"/>
               </w:rPr>
-              <w:t>Die Zielgruppe</w:t>
+              <w:t>Das Ökosystem — ein System, nicht fünf Massnahmen</w:t>
             </w:r>
           </w:p>
         </w:tc>
@@ -2773,17 +3623,19 @@
             </w:pPr>
             <w:r>
               <w:rPr>
+                <w:rFonts w:ascii="Calibri" w:hAnsi="Calibri"/>
                 <w:b/>
                 <w:color w:val="055A8D"/>
                 <w:sz w:val="20"/>
               </w:rPr>
-              <w:t xml:space="preserve">  → </w:t>
+              <w:t xml:space="preserve">  →  </w:t>
             </w:r>
             <w:r>
               <w:rPr>
+                <w:rFonts w:ascii="Calibri" w:hAnsi="Calibri"/>
                 <w:sz w:val="20"/>
               </w:rPr>
-              <w:t>Investoren: Unternehmer mit Privatvermögen — 68 Inhaber bereits im Follower-Kreis</w:t>
+              <w:t>Print → LinkedIn → Newsletter: ein Inhalt, dreifache Wirkung</w:t>
             </w:r>
           </w:p>
           <w:p>
@@ -2792,17 +3644,19 @@
             </w:pPr>
             <w:r>
               <w:rPr>
+                <w:rFonts w:ascii="Calibri" w:hAnsi="Calibri"/>
                 <w:b/>
                 <w:color w:val="055A8D"/>
                 <w:sz w:val="20"/>
               </w:rPr>
-              <w:t xml:space="preserve">  → </w:t>
+              <w:t xml:space="preserve">  →  </w:t>
             </w:r>
             <w:r>
               <w:rPr>
+                <w:rFonts w:ascii="Calibri" w:hAnsi="Calibri"/>
                 <w:sz w:val="20"/>
               </w:rPr>
-              <w:t>Landeigentümer / Erbengemeinschaften: bislang unbespielt, offline + via Multiplikatoren</w:t>
+              <w:t>Instagram → Kampagnen → Website: Schaufenster, Funnel, Konversion</w:t>
             </w:r>
           </w:p>
           <w:p>
@@ -2811,17 +3665,19 @@
             </w:pPr>
             <w:r>
               <w:rPr>
+                <w:rFonts w:ascii="Calibri" w:hAnsi="Calibri"/>
                 <w:b/>
                 <w:color w:val="055A8D"/>
                 <w:sz w:val="20"/>
               </w:rPr>
-              <w:t xml:space="preserve">  → </w:t>
+              <w:t xml:space="preserve">  →  </w:t>
             </w:r>
             <w:r>
               <w:rPr>
+                <w:rFonts w:ascii="Calibri" w:hAnsi="Calibri"/>
                 <w:sz w:val="20"/>
               </w:rPr>
-              <w:t>Treuhänder &amp; Notare: Empfehlungsbrücke, aktiviert durch Rogers Sichtbarkeit</w:t>
+              <w:t>Jeder Kanal mit klar definierter Aufgabe im Gesamtsystem</w:t>
             </w:r>
           </w:p>
           <w:p>
@@ -2830,17 +3686,19 @@
             </w:pPr>
             <w:r>
               <w:rPr>
+                <w:rFonts w:ascii="Calibri" w:hAnsi="Calibri"/>
                 <w:b/>
                 <w:color w:val="055A8D"/>
                 <w:sz w:val="20"/>
               </w:rPr>
-              <w:t xml:space="preserve">  → </w:t>
+              <w:t xml:space="preserve">  →  </w:t>
             </w:r>
             <w:r>
               <w:rPr>
+                <w:rFonts w:ascii="Calibri" w:hAnsi="Calibri"/>
                 <w:sz w:val="20"/>
               </w:rPr>
-              <w:t>Käufer: emotionale Du-Ansprache + konkrete Fakten</w:t>
+              <w:t>Mournival orchestriert — Pam koordiniert — Roger ist das Gesicht</w:t>
             </w:r>
           </w:p>
           <w:p>
@@ -2849,17 +3707,19 @@
             </w:pPr>
             <w:r>
               <w:rPr>
+                <w:rFonts w:ascii="Calibri" w:hAnsi="Calibri"/>
                 <w:b/>
                 <w:color w:val="055A8D"/>
                 <w:sz w:val="20"/>
               </w:rPr>
-              <w:t xml:space="preserve">  → </w:t>
+              <w:t xml:space="preserve">  →  </w:t>
             </w:r>
             <w:r>
               <w:rPr>
+                <w:rFonts w:ascii="Calibri" w:hAnsi="Calibri"/>
                 <w:sz w:val="20"/>
               </w:rPr>
-              <w:t>80% der Audience aus dem Grossraum Zürich — stark regional</w:t>
+              <w:t>Das ist der Unterschied zu klassischer Social-Media-Agentur</w:t>
             </w:r>
           </w:p>
         </w:tc>
@@ -2867,7 +3727,7 @@
     </w:tbl>
     <w:p>
       <w:pPr>
-        <w:spacing w:after="80"/>
+        <w:spacing w:after="120"/>
       </w:pPr>
     </w:p>
     <w:tbl>
@@ -2887,185 +3747,23 @@
           </w:tcPr>
           <w:p>
             <w:pPr>
-              <w:spacing w:before="100" w:after="100"/>
+              <w:spacing w:before="120" w:after="120"/>
             </w:pPr>
             <w:r>
               <w:rPr>
+                <w:rFonts w:ascii="Calibri" w:hAnsi="Calibri"/>
                 <w:b/>
-                <w:color w:val="AACCEE"/>
-                <w:sz w:val="22"/>
-              </w:rPr>
-              <w:t xml:space="preserve">  04  </w:t>
-            </w:r>
-            <w:r>
-              <w:rPr>
-                <w:b/>
-                <w:color w:val="FFFFFF"/>
-                <w:sz w:val="24"/>
-              </w:rPr>
-              <w:t>Wie kommen wir dahin?</w:t>
-            </w:r>
-          </w:p>
-        </w:tc>
-      </w:tr>
-    </w:tbl>
-    <w:tbl>
-      <w:tblPr>
-        <w:tblStyle w:val="TableGrid"/>
-        <w:tblW w:type="auto" w:w="0"/>
-        <w:tblLook w:firstColumn="1" w:firstRow="1" w:lastColumn="0" w:lastRow="0" w:noHBand="0" w:noVBand="1" w:val="04A0"/>
-      </w:tblPr>
-      <w:tblGrid>
-        <w:gridCol w:w="9066"/>
-      </w:tblGrid>
-      <w:tr>
-        <w:tc>
-          <w:tcPr>
-            <w:tcW w:type="dxa" w:w="9066"/>
-            <w:shd w:val="clear" w:color="auto" w:fill="F5FAFD"/>
-            <w:tcBorders>
-              <w:top w:val="none" w:sz="4" w:space="0" w:color="auto"/>
-              <w:left w:val="single" w:sz="4" w:space="0" w:color="055a8d"/>
-              <w:bottom w:val="single" w:sz="4" w:space="0" w:color="CCDDEE"/>
-              <w:right w:val="single" w:sz="4" w:space="0" w:color="CCDDEE"/>
-            </w:tcBorders>
-          </w:tcPr>
-          <w:p/>
-          <w:p>
-            <w:pPr>
-              <w:spacing w:after="60"/>
-            </w:pPr>
-            <w:r>
-              <w:rPr>
-                <w:b/>
-                <w:color w:val="055A8D"/>
-                <w:sz w:val="20"/>
-              </w:rPr>
-              <w:t xml:space="preserve">  → </w:t>
-            </w:r>
-            <w:r>
-              <w:rPr>
-                <w:sz w:val="20"/>
-              </w:rPr>
-              <w:t>System für Sichtbarkeit statt Content-Programm</w:t>
-            </w:r>
-          </w:p>
-          <w:p>
-            <w:pPr>
-              <w:spacing w:before="40" w:after="60"/>
-            </w:pPr>
-            <w:r>
-              <w:rPr>
-                <w:b/>
-                <w:color w:val="055A8D"/>
-                <w:sz w:val="20"/>
-              </w:rPr>
-              <w:t xml:space="preserve">  → </w:t>
-            </w:r>
-            <w:r>
-              <w:rPr>
-                <w:sz w:val="20"/>
-              </w:rPr>
-              <w:t>Interaktion schlägt Posting: wöchentliches Community Management als Hebel</w:t>
-            </w:r>
-          </w:p>
-          <w:p>
-            <w:pPr>
-              <w:spacing w:before="40" w:after="60"/>
-            </w:pPr>
-            <w:r>
-              <w:rPr>
-                <w:b/>
-                <w:color w:val="055A8D"/>
-                <w:sz w:val="20"/>
-              </w:rPr>
-              <w:t xml:space="preserve">  → </w:t>
-            </w:r>
-            <w:r>
-              <w:rPr>
-                <w:sz w:val="20"/>
-              </w:rPr>
-              <w:t>Jeder Kanal mit klarer Rolle: LinkedIn / Instagram / Newsletter / Print</w:t>
-            </w:r>
-          </w:p>
-          <w:p>
-            <w:pPr>
-              <w:spacing w:before="40" w:after="60"/>
-            </w:pPr>
-            <w:r>
-              <w:rPr>
-                <w:b/>
-                <w:color w:val="055A8D"/>
-                <w:sz w:val="20"/>
-              </w:rPr>
-              <w:t xml:space="preserve">  → </w:t>
-            </w:r>
-            <w:r>
-              <w:rPr>
-                <w:sz w:val="20"/>
-              </w:rPr>
-              <w:t>Alex orchestriert im Hintergrund — Roger bleibt das Gesicht</w:t>
-            </w:r>
-          </w:p>
-          <w:p>
-            <w:pPr>
-              <w:spacing w:before="40" w:after="60"/>
-            </w:pPr>
-            <w:r>
-              <w:rPr>
-                <w:b/>
-                <w:color w:val="055A8D"/>
-                <w:sz w:val="20"/>
-              </w:rPr>
-              <w:t xml:space="preserve">  → </w:t>
-            </w:r>
-            <w:r>
-              <w:rPr>
-                <w:sz w:val="20"/>
-              </w:rPr>
-              <w:t>Immobilien = Beziehungsaufbau, kein Auto-Verkauf</w:t>
-            </w:r>
-          </w:p>
-        </w:tc>
-      </w:tr>
-    </w:tbl>
-    <w:p>
-      <w:pPr>
-        <w:spacing w:after="80"/>
-      </w:pPr>
-    </w:p>
-    <w:tbl>
-      <w:tblPr>
-        <w:tblStyle w:val="TableGrid"/>
-        <w:tblW w:type="auto" w:w="0"/>
-        <w:tblLook w:firstColumn="1" w:firstRow="1" w:lastColumn="0" w:lastRow="0" w:noHBand="0" w:noVBand="1" w:val="04A0"/>
-      </w:tblPr>
-      <w:tblGrid>
-        <w:gridCol w:w="9066"/>
-      </w:tblGrid>
-      <w:tr>
-        <w:tc>
-          <w:tcPr>
-            <w:tcW w:type="dxa" w:w="9066"/>
-            <w:shd w:val="clear" w:color="auto" w:fill="055a8d"/>
-          </w:tcPr>
-          <w:p>
-            <w:pPr>
-              <w:spacing w:before="100" w:after="100"/>
-            </w:pPr>
-            <w:r>
-              <w:rPr>
-                <w:b/>
-                <w:color w:val="AACCEE"/>
+                <w:color w:val="99BBDD"/>
                 <w:sz w:val="22"/>
               </w:rPr>
               <w:t xml:space="preserve">  05  </w:t>
             </w:r>
             <w:r>
               <w:rPr>
+                <w:rFonts w:ascii="Calibri" w:hAnsi="Calibri"/>
                 <w:b/>
                 <w:color w:val="FFFFFF"/>
-                <w:sz w:val="24"/>
+                <w:sz w:val="25"/>
               </w:rPr>
               <w:t>Der Funnel</w:t>
             </w:r>
@@ -3101,14 +3799,16 @@
             </w:pPr>
             <w:r>
               <w:rPr>
+                <w:rFonts w:ascii="Calibri" w:hAnsi="Calibri"/>
                 <w:b/>
                 <w:color w:val="055A8D"/>
                 <w:sz w:val="20"/>
               </w:rPr>
-              <w:t xml:space="preserve">  → </w:t>
+              <w:t xml:space="preserve">  →  </w:t>
             </w:r>
             <w:r>
               <w:rPr>
+                <w:rFonts w:ascii="Calibri" w:hAnsi="Calibri"/>
                 <w:sz w:val="20"/>
               </w:rPr>
               <w:t>Awareness: Community Management, Kampagnen, Einladungen durch Alex</w:t>
@@ -3120,14 +3820,16 @@
             </w:pPr>
             <w:r>
               <w:rPr>
+                <w:rFonts w:ascii="Calibri" w:hAnsi="Calibri"/>
                 <w:b/>
                 <w:color w:val="055A8D"/>
                 <w:sz w:val="20"/>
               </w:rPr>
-              <w:t xml:space="preserve">  → </w:t>
+              <w:t xml:space="preserve">  →  </w:t>
             </w:r>
             <w:r>
               <w:rPr>
+                <w:rFonts w:ascii="Calibri" w:hAnsi="Calibri"/>
                 <w:sz w:val="20"/>
               </w:rPr>
               <w:t>Interesse: Mehrwert-Content, Objekte mit Zahlen, Roger als Fachstimme</w:t>
@@ -3139,17 +3841,19 @@
             </w:pPr>
             <w:r>
               <w:rPr>
+                <w:rFonts w:ascii="Calibri" w:hAnsi="Calibri"/>
                 <w:b/>
                 <w:color w:val="055A8D"/>
                 <w:sz w:val="20"/>
               </w:rPr>
-              <w:t xml:space="preserve">  → </w:t>
+              <w:t xml:space="preserve">  →  </w:t>
             </w:r>
             <w:r>
               <w:rPr>
+                <w:rFonts w:ascii="Calibri" w:hAnsi="Calibri"/>
                 <w:sz w:val="20"/>
               </w:rPr>
-              <w:t>Bindung: Newsletter überbrückt lange Entscheidungszyklen</w:t>
+              <w:t>Bindung: Newsletter überbrückt die langen Immobilien-Entscheidungszyklen</w:t>
             </w:r>
           </w:p>
           <w:p>
@@ -3158,17 +3862,19 @@
             </w:pPr>
             <w:r>
               <w:rPr>
+                <w:rFonts w:ascii="Calibri" w:hAnsi="Calibri"/>
                 <w:b/>
                 <w:color w:val="055A8D"/>
                 <w:sz w:val="20"/>
               </w:rPr>
-              <w:t xml:space="preserve">  → </w:t>
+              <w:t xml:space="preserve">  →  </w:t>
             </w:r>
             <w:r>
               <w:rPr>
+                <w:rFonts w:ascii="Calibri" w:hAnsi="Calibri"/>
                 <w:sz w:val="20"/>
               </w:rPr>
-              <w:t>Empfehlung: Multiplikatoren → zurück in Awareness</w:t>
+              <w:t>Empfehlung: Multiplikatoren leiten weiter → zurück in Awareness</w:t>
             </w:r>
           </w:p>
           <w:p>
@@ -3177,14 +3883,16 @@
             </w:pPr>
             <w:r>
               <w:rPr>
+                <w:rFonts w:ascii="Calibri" w:hAnsi="Calibri"/>
                 <w:b/>
                 <w:color w:val="055A8D"/>
                 <w:sz w:val="20"/>
               </w:rPr>
-              <w:t xml:space="preserve">  → </w:t>
+              <w:t xml:space="preserve">  →  </w:t>
             </w:r>
             <w:r>
               <w:rPr>
+                <w:rFonts w:ascii="Calibri" w:hAnsi="Calibri"/>
                 <w:sz w:val="20"/>
               </w:rPr>
               <w:t>Beweis: erste Investor-Conversion aus laufender Kampagne</w:t>
@@ -3195,7 +3903,7 @@
     </w:tbl>
     <w:p>
       <w:pPr>
-        <w:spacing w:after="80"/>
+        <w:spacing w:after="120"/>
       </w:pPr>
     </w:p>
     <w:tbl>
@@ -3215,23 +3923,25 @@
           </w:tcPr>
           <w:p>
             <w:pPr>
-              <w:spacing w:before="100" w:after="100"/>
+              <w:spacing w:before="120" w:after="120"/>
             </w:pPr>
             <w:r>
               <w:rPr>
+                <w:rFonts w:ascii="Calibri" w:hAnsi="Calibri"/>
                 <w:b/>
-                <w:color w:val="AACCEE"/>
+                <w:color w:val="99BBDD"/>
                 <w:sz w:val="22"/>
               </w:rPr>
               <w:t xml:space="preserve">  06  </w:t>
             </w:r>
             <w:r>
               <w:rPr>
+                <w:rFonts w:ascii="Calibri" w:hAnsi="Calibri"/>
                 <w:b/>
                 <w:color w:val="FFFFFF"/>
-                <w:sz w:val="24"/>
+                <w:sz w:val="25"/>
               </w:rPr>
-              <w:t>Die Elemente</w:t>
+              <w:t>Community Management — der Gamechanger</w:t>
             </w:r>
           </w:p>
         </w:tc>
@@ -3265,17 +3975,19 @@
             </w:pPr>
             <w:r>
               <w:rPr>
+                <w:rFonts w:ascii="Calibri" w:hAnsi="Calibri"/>
                 <w:b/>
                 <w:color w:val="055A8D"/>
                 <w:sz w:val="20"/>
               </w:rPr>
-              <w:t xml:space="preserve">  → </w:t>
+              <w:t xml:space="preserve">  →  </w:t>
             </w:r>
             <w:r>
               <w:rPr>
+                <w:rFonts w:ascii="Calibri" w:hAnsi="Calibri"/>
                 <w:sz w:val="20"/>
               </w:rPr>
-              <w:t>LinkedIn: 2 Firmen-Posts + 1–2 Roger-Posts/Woche — alle 4 Ziele bespielt</w:t>
+              <w:t>DER Hebel bei 394 Followern: aktive Teilnahme an Gesprächen</w:t>
             </w:r>
           </w:p>
           <w:p>
@@ -3284,17 +3996,19 @@
             </w:pPr>
             <w:r>
               <w:rPr>
+                <w:rFonts w:ascii="Calibri" w:hAnsi="Calibri"/>
                 <w:b/>
                 <w:color w:val="055A8D"/>
                 <w:sz w:val="20"/>
               </w:rPr>
-              <w:t xml:space="preserve">  → </w:t>
+              <w:t xml:space="preserve">  →  </w:t>
             </w:r>
             <w:r>
               <w:rPr>
+                <w:rFonts w:ascii="Calibri" w:hAnsi="Calibri"/>
                 <w:sz w:val="20"/>
               </w:rPr>
-              <w:t>Community Management: Roger 1×/Woche, KI-Workflow, Alex lädt Kontakte ein</w:t>
+              <w:t>Roger kommentiert substanziell — nicht liken, sondern mitreden</w:t>
             </w:r>
           </w:p>
           <w:p>
@@ -3303,17 +4017,19 @@
             </w:pPr>
             <w:r>
               <w:rPr>
+                <w:rFonts w:ascii="Calibri" w:hAnsi="Calibri"/>
                 <w:b/>
                 <w:color w:val="055A8D"/>
                 <w:sz w:val="20"/>
               </w:rPr>
-              <w:t xml:space="preserve">  → </w:t>
+              <w:t xml:space="preserve">  →  </w:t>
             </w:r>
             <w:r>
               <w:rPr>
+                <w:rFonts w:ascii="Calibri" w:hAnsi="Calibri"/>
                 <w:sz w:val="20"/>
               </w:rPr>
-              <w:t>Instagram: digitales Schaufenster für Qualität &amp; Vertrauen</w:t>
+              <w:t>Start 1×/Woche, Ziel: schrittweise mehrere Interaktionen/Woche</w:t>
             </w:r>
           </w:p>
           <w:p>
@@ -3322,17 +4038,19 @@
             </w:pPr>
             <w:r>
               <w:rPr>
+                <w:rFonts w:ascii="Calibri" w:hAnsi="Calibri"/>
                 <w:b/>
                 <w:color w:val="055A8D"/>
                 <w:sz w:val="20"/>
               </w:rPr>
-              <w:t xml:space="preserve">  → </w:t>
+              <w:t xml:space="preserve">  →  </w:t>
             </w:r>
             <w:r>
               <w:rPr>
+                <w:rFonts w:ascii="Calibri" w:hAnsi="Calibri"/>
                 <w:sz w:val="20"/>
               </w:rPr>
-              <w:t>Kampagnen: immer eine aktiv, Newsletter als Zwischenschritt</w:t>
+              <w:t>Mournival entwickelt Workflow: fertige Vorschläge, ein Klick Roger</w:t>
             </w:r>
           </w:p>
           <w:p>
@@ -3341,17 +4059,19 @@
             </w:pPr>
             <w:r>
               <w:rPr>
+                <w:rFonts w:ascii="Calibri" w:hAnsi="Calibri"/>
                 <w:b/>
                 <w:color w:val="055A8D"/>
                 <w:sz w:val="20"/>
               </w:rPr>
-              <w:t xml:space="preserve">  → </w:t>
+              <w:t xml:space="preserve">  →  </w:t>
             </w:r>
             <w:r>
               <w:rPr>
+                <w:rFonts w:ascii="Calibri" w:hAnsi="Calibri"/>
                 <w:sz w:val="20"/>
               </w:rPr>
-              <w:t>Fachartikel: Glattaler / IMMOBILIEN Business / NZZ Residence</w:t>
+              <w:t>Alex lädt Rogers Kontakte zur Belle Immo Seite ein</w:t>
             </w:r>
           </w:p>
         </w:tc>
@@ -3359,7 +4079,7 @@
     </w:tbl>
     <w:p>
       <w:pPr>
-        <w:spacing w:after="80"/>
+        <w:spacing w:after="120"/>
       </w:pPr>
     </w:p>
     <w:tbl>
@@ -3379,23 +4099,25 @@
           </w:tcPr>
           <w:p>
             <w:pPr>
-              <w:spacing w:before="100" w:after="100"/>
+              <w:spacing w:before="120" w:after="120"/>
             </w:pPr>
             <w:r>
               <w:rPr>
+                <w:rFonts w:ascii="Calibri" w:hAnsi="Calibri"/>
                 <w:b/>
-                <w:color w:val="AACCEE"/>
+                <w:color w:val="99BBDD"/>
                 <w:sz w:val="22"/>
               </w:rPr>
               <w:t xml:space="preserve">  07  </w:t>
             </w:r>
             <w:r>
               <w:rPr>
+                <w:rFonts w:ascii="Calibri" w:hAnsi="Calibri"/>
                 <w:b/>
                 <w:color w:val="FFFFFF"/>
-                <w:sz w:val="24"/>
+                <w:sz w:val="25"/>
               </w:rPr>
-              <w:t>Fazit &amp; offene Punkte</w:t>
+              <w:t>Newsletter — das Asset, das Belle Immo gehört</w:t>
             </w:r>
           </w:p>
         </w:tc>
@@ -3429,17 +4151,19 @@
             </w:pPr>
             <w:r>
               <w:rPr>
+                <w:rFonts w:ascii="Calibri" w:hAnsi="Calibri"/>
                 <w:b/>
                 <w:color w:val="055A8D"/>
                 <w:sz w:val="20"/>
               </w:rPr>
-              <w:t xml:space="preserve">  → </w:t>
+              <w:t xml:space="preserve">  →  </w:t>
             </w:r>
             <w:r>
               <w:rPr>
+                <w:rFonts w:ascii="Calibri" w:hAnsi="Calibri"/>
                 <w:sz w:val="20"/>
               </w:rPr>
-              <w:t>Elemente greifen ineinander zur selbsttragenden Sichtbarkeits-Maschine</w:t>
+              <w:t>Social Media gehört Meta. LinkedIn gehört Microsoft. Newsletter gehört Belle Immo.</w:t>
             </w:r>
           </w:p>
           <w:p>
@@ -3448,17 +4172,19 @@
             </w:pPr>
             <w:r>
               <w:rPr>
+                <w:rFonts w:ascii="Calibri" w:hAnsi="Calibri"/>
                 <w:b/>
                 <w:color w:val="055A8D"/>
                 <w:sz w:val="20"/>
               </w:rPr>
-              <w:t xml:space="preserve">  → </w:t>
+              <w:t xml:space="preserve">  →  </w:t>
             </w:r>
             <w:r>
               <w:rPr>
+                <w:rFonts w:ascii="Calibri" w:hAnsi="Calibri"/>
                 <w:sz w:val="20"/>
               </w:rPr>
-              <w:t>Investor-Kampagne auf Basis erster Conversion weiterentwickeln</w:t>
+              <w:t>Eigene Community — unabhängig von Algorithmen und Plattformentscheiden</w:t>
             </w:r>
           </w:p>
           <w:p>
@@ -3467,17 +4193,19 @@
             </w:pPr>
             <w:r>
               <w:rPr>
+                <w:rFonts w:ascii="Calibri" w:hAnsi="Calibri"/>
                 <w:b/>
                 <w:color w:val="055A8D"/>
                 <w:sz w:val="20"/>
               </w:rPr>
-              <w:t xml:space="preserve">  → </w:t>
+              <w:t xml:space="preserve">  →  </w:t>
             </w:r>
             <w:r>
               <w:rPr>
+                <w:rFonts w:ascii="Calibri" w:hAnsi="Calibri"/>
                 <w:sz w:val="20"/>
               </w:rPr>
-              <w:t>KI-Workflow &amp; Rollen final aufsetzen: KI → Agent → Robin → Roger</w:t>
+              <w:t>Zwischenschritt zwischen Reichweite und Anfrage über lange Zyklen</w:t>
             </w:r>
           </w:p>
           <w:p>
@@ -3486,17 +4214,19 @@
             </w:pPr>
             <w:r>
               <w:rPr>
+                <w:rFonts w:ascii="Calibri" w:hAnsi="Calibri"/>
                 <w:b/>
                 <w:color w:val="055A8D"/>
                 <w:sz w:val="20"/>
               </w:rPr>
-              <w:t xml:space="preserve">  → </w:t>
+              <w:t xml:space="preserve">  →  </w:t>
             </w:r>
             <w:r>
               <w:rPr>
+                <w:rFonts w:ascii="Calibri" w:hAnsi="Calibri"/>
                 <w:sz w:val="20"/>
               </w:rPr>
-              <w:t>Print-Schiene: Einstieg mit Glattaler oder IMMOBILIEN Business?</w:t>
+              <w:t>Content-Multiplikator: Newsletter → LinkedIn → Print</w:t>
             </w:r>
           </w:p>
           <w:p>
@@ -3505,17 +4235,19 @@
             </w:pPr>
             <w:r>
               <w:rPr>
+                <w:rFonts w:ascii="Calibri" w:hAnsi="Calibri"/>
                 <w:b/>
                 <w:color w:val="055A8D"/>
                 <w:sz w:val="20"/>
               </w:rPr>
-              <w:t xml:space="preserve">  → </w:t>
+              <w:t xml:space="preserve">  →  </w:t>
             </w:r>
             <w:r>
               <w:rPr>
+                <w:rFonts w:ascii="Calibri" w:hAnsi="Calibri"/>
                 <w:sz w:val="20"/>
               </w:rPr>
-              <w:t>Newsletter-Aufsatz: Tooling und Lead-Magnet festlegen</w:t>
+              <w:t>Langfristig wertvollster Kanal im Gesamtsystem</w:t>
             </w:r>
           </w:p>
         </w:tc>
@@ -3523,7 +4255,183 @@
     </w:tbl>
     <w:p>
       <w:pPr>
-        <w:spacing w:after="80"/>
+        <w:spacing w:after="120"/>
+      </w:pPr>
+    </w:p>
+    <w:tbl>
+      <w:tblPr>
+        <w:tblStyle w:val="TableGrid"/>
+        <w:tblW w:type="auto" w:w="0"/>
+        <w:tblLook w:firstColumn="1" w:firstRow="1" w:lastColumn="0" w:lastRow="0" w:noHBand="0" w:noVBand="1" w:val="04A0"/>
+      </w:tblPr>
+      <w:tblGrid>
+        <w:gridCol w:w="9066"/>
+      </w:tblGrid>
+      <w:tr>
+        <w:tc>
+          <w:tcPr>
+            <w:tcW w:type="dxa" w:w="9066"/>
+            <w:shd w:val="clear" w:color="auto" w:fill="055a8d"/>
+          </w:tcPr>
+          <w:p>
+            <w:pPr>
+              <w:spacing w:before="120" w:after="120"/>
+            </w:pPr>
+            <w:r>
+              <w:rPr>
+                <w:rFonts w:ascii="Calibri" w:hAnsi="Calibri"/>
+                <w:b/>
+                <w:color w:val="99BBDD"/>
+                <w:sz w:val="22"/>
+              </w:rPr>
+              <w:t xml:space="preserve">  08  </w:t>
+            </w:r>
+            <w:r>
+              <w:rPr>
+                <w:rFonts w:ascii="Calibri" w:hAnsi="Calibri"/>
+                <w:b/>
+                <w:color w:val="FFFFFF"/>
+                <w:sz w:val="25"/>
+              </w:rPr>
+              <w:t>Nächste Schritte</w:t>
+            </w:r>
+          </w:p>
+        </w:tc>
+      </w:tr>
+    </w:tbl>
+    <w:tbl>
+      <w:tblPr>
+        <w:tblStyle w:val="TableGrid"/>
+        <w:tblW w:type="auto" w:w="0"/>
+        <w:tblLook w:firstColumn="1" w:firstRow="1" w:lastColumn="0" w:lastRow="0" w:noHBand="0" w:noVBand="1" w:val="04A0"/>
+      </w:tblPr>
+      <w:tblGrid>
+        <w:gridCol w:w="9066"/>
+      </w:tblGrid>
+      <w:tr>
+        <w:tc>
+          <w:tcPr>
+            <w:tcW w:type="dxa" w:w="9066"/>
+            <w:shd w:val="clear" w:color="auto" w:fill="F5FAFD"/>
+            <w:tcBorders>
+              <w:top w:val="none" w:sz="4" w:space="0" w:color="auto"/>
+              <w:left w:val="single" w:sz="4" w:space="0" w:color="055a8d"/>
+              <w:bottom w:val="single" w:sz="4" w:space="0" w:color="CCDDEE"/>
+              <w:right w:val="single" w:sz="4" w:space="0" w:color="CCDDEE"/>
+            </w:tcBorders>
+          </w:tcPr>
+          <w:p/>
+          <w:p>
+            <w:pPr>
+              <w:spacing w:after="60"/>
+            </w:pPr>
+            <w:r>
+              <w:rPr>
+                <w:rFonts w:ascii="Calibri" w:hAnsi="Calibri"/>
+                <w:b/>
+                <w:color w:val="055A8D"/>
+                <w:sz w:val="20"/>
+              </w:rPr>
+              <w:t xml:space="preserve">  →  </w:t>
+            </w:r>
+            <w:r>
+              <w:rPr>
+                <w:rFonts w:ascii="Calibri" w:hAnsi="Calibri"/>
+                <w:sz w:val="20"/>
+              </w:rPr>
+              <w:t>Community Management starten: Roger 1×/Woche, Alex lädt Kontakte ein</w:t>
+            </w:r>
+          </w:p>
+          <w:p>
+            <w:pPr>
+              <w:spacing w:before="40" w:after="60"/>
+            </w:pPr>
+            <w:r>
+              <w:rPr>
+                <w:rFonts w:ascii="Calibri" w:hAnsi="Calibri"/>
+                <w:b/>
+                <w:color w:val="055A8D"/>
+                <w:sz w:val="20"/>
+              </w:rPr>
+              <w:t xml:space="preserve">  →  </w:t>
+            </w:r>
+            <w:r>
+              <w:rPr>
+                <w:rFonts w:ascii="Calibri" w:hAnsi="Calibri"/>
+                <w:sz w:val="20"/>
+              </w:rPr>
+              <w:t>Workflow aufsetzen: Mournival baut Prozess für minimalen Aufwand</w:t>
+            </w:r>
+          </w:p>
+          <w:p>
+            <w:pPr>
+              <w:spacing w:before="40" w:after="60"/>
+            </w:pPr>
+            <w:r>
+              <w:rPr>
+                <w:rFonts w:ascii="Calibri" w:hAnsi="Calibri"/>
+                <w:b/>
+                <w:color w:val="055A8D"/>
+                <w:sz w:val="20"/>
+              </w:rPr>
+              <w:t xml:space="preserve">  →  </w:t>
+            </w:r>
+            <w:r>
+              <w:rPr>
+                <w:rFonts w:ascii="Calibri" w:hAnsi="Calibri"/>
+                <w:sz w:val="20"/>
+              </w:rPr>
+              <w:t>Content-Mix Q3 + Investor-Kampagne reviewen</w:t>
+            </w:r>
+          </w:p>
+          <w:p>
+            <w:pPr>
+              <w:spacing w:before="40" w:after="60"/>
+            </w:pPr>
+            <w:r>
+              <w:rPr>
+                <w:rFonts w:ascii="Calibri" w:hAnsi="Calibri"/>
+                <w:b/>
+                <w:color w:val="055A8D"/>
+                <w:sz w:val="20"/>
+              </w:rPr>
+              <w:t xml:space="preserve">  →  </w:t>
+            </w:r>
+            <w:r>
+              <w:rPr>
+                <w:rFonts w:ascii="Calibri" w:hAnsi="Calibri"/>
+                <w:sz w:val="20"/>
+              </w:rPr>
+              <w:t>Newsletter konzipieren: Lead-Magnet und Tooling</w:t>
+            </w:r>
+          </w:p>
+          <w:p>
+            <w:pPr>
+              <w:spacing w:before="40" w:after="60"/>
+            </w:pPr>
+            <w:r>
+              <w:rPr>
+                <w:rFonts w:ascii="Calibri" w:hAnsi="Calibri"/>
+                <w:b/>
+                <w:color w:val="055A8D"/>
+                <w:sz w:val="20"/>
+              </w:rPr>
+              <w:t xml:space="preserve">  →  </w:t>
+            </w:r>
+            <w:r>
+              <w:rPr>
+                <w:rFonts w:ascii="Calibri" w:hAnsi="Calibri"/>
+                <w:sz w:val="20"/>
+              </w:rPr>
+              <w:t>Fachartikel-Schiene: Erstgespräch Glattaler / IMMOBILIEN Business</w:t>
+            </w:r>
+          </w:p>
+        </w:tc>
+      </w:tr>
+    </w:tbl>
+    <w:p>
+      <w:pPr>
+        <w:spacing w:after="120"/>
       </w:pPr>
     </w:p>
     <w:sectPr>
@@ -3901,7 +4809,7 @@
     <w:rsid w:val="00FC693F"/>
     <w:rPr>
       <w:rFonts w:ascii="Calibri" w:hAnsi="Calibri"/>
-      <w:color w:val="333333"/>
+      <w:color w:val="222222"/>
       <w:sz w:val="21"/>
     </w:rPr>
   </w:style>

</xml_diff>